<commit_message>
Doc sync round 1 – 12/09
</commit_message>
<xml_diff>
--- a/Docs/QA-Testing/Test_Summary_Report.docx
+++ b/Docs/QA-Testing/Test_Summary_Report.docx
@@ -1,6 +1,6 @@
 
 <file path=word/document.xml><?xml version="1.0" encoding="utf-8"?>
-<w:document xmlns:wpc="http://schemas.microsoft.com/office/word/2010/wordprocessingCanvas" xmlns:cx="http://schemas.microsoft.com/office/drawing/2014/chartex" xmlns:cx1="http://schemas.microsoft.com/office/drawing/2015/9/8/chartex" xmlns:cx2="http://schemas.microsoft.com/office/drawing/2015/10/21/chartex" xmlns:cx3="http://schemas.microsoft.com/office/drawing/2016/5/9/chartex" xmlns:cx4="http://schemas.microsoft.com/office/drawing/2016/5/10/chartex" xmlns:cx5="http://schemas.microsoft.com/office/drawing/2016/5/11/chartex" xmlns:cx6="http://schemas.microsoft.com/office/drawing/2016/5/12/chartex" xmlns:cx7="http://schemas.microsoft.com/office/drawing/2016/5/13/chartex" xmlns:cx8="http://schemas.microsoft.com/office/drawing/2016/5/14/chartex" xmlns:mc="http://schemas.openxmlformats.org/markup-compatibility/2006" xmlns:aink="http://schemas.microsoft.com/office/drawing/2016/ink" xmlns:am3d="http://schemas.microsoft.com/office/drawing/2017/model3d" xmlns:o="urn:schemas-microsoft-com:office:office" xmlns:r="http://schemas.openxmlformats.org/officeDocument/2006/relationships" xmlns:m="http://schemas.openxmlformats.org/officeDocument/2006/math" xmlns:v="urn:schemas-microsoft-com:vml" xmlns:wp14="http://schemas.microsoft.com/office/word/2010/wordprocessingDrawing" xmlns:wp="http://schemas.openxmlformats.org/drawingml/2006/wordprocessingDrawing" xmlns:w10="urn:schemas-microsoft-com:office:word" xmlns:w="http://schemas.openxmlformats.org/wordprocessingml/2006/main" xmlns:w14="http://schemas.microsoft.com/office/word/2010/wordml" xmlns:w15="http://schemas.microsoft.com/office/word/2012/wordml" xmlns:w16cid="http://schemas.microsoft.com/office/word/2016/wordml/cid" xmlns:w16se="http://schemas.microsoft.com/office/word/2015/wordml/symex" xmlns:wpg="http://schemas.microsoft.com/office/word/2010/wordprocessingGroup" xmlns:wpi="http://schemas.microsoft.com/office/word/2010/wordprocessingInk" xmlns:wne="http://schemas.microsoft.com/office/word/2006/wordml" xmlns:wps="http://schemas.microsoft.com/office/word/2010/wordprocessingShape" mc:Ignorable="w14 w15 w16se w16cid wp14">
+<w:document xmlns:wpc="http://schemas.microsoft.com/office/word/2010/wordprocessingCanvas" xmlns:cx="http://schemas.microsoft.com/office/drawing/2014/chartex" xmlns:cx1="http://schemas.microsoft.com/office/drawing/2015/9/8/chartex" xmlns:cx2="http://schemas.microsoft.com/office/drawing/2015/10/21/chartex" xmlns:cx3="http://schemas.microsoft.com/office/drawing/2016/5/9/chartex" xmlns:cx4="http://schemas.microsoft.com/office/drawing/2016/5/10/chartex" xmlns:cx5="http://schemas.microsoft.com/office/drawing/2016/5/11/chartex" xmlns:cx6="http://schemas.microsoft.com/office/drawing/2016/5/12/chartex" xmlns:cx7="http://schemas.microsoft.com/office/drawing/2016/5/13/chartex" xmlns:cx8="http://schemas.microsoft.com/office/drawing/2016/5/14/chartex" xmlns:mc="http://schemas.openxmlformats.org/markup-compatibility/2006" xmlns:m="http://schemas.openxmlformats.org/officeDocument/2006/math" xmlns:aink="http://schemas.microsoft.com/office/drawing/2016/ink" xmlns:am3d="http://schemas.microsoft.com/office/drawing/2017/model3d" xmlns:oel="http://schemas.microsoft.com/office/2019/extlst" xmlns:r="http://schemas.openxmlformats.org/officeDocument/2006/relationships" xmlns:wp14="http://schemas.microsoft.com/office/word/2010/wordprocessingDrawing" xmlns:wp="http://schemas.openxmlformats.org/drawingml/2006/wordprocessingDrawing" xmlns:wpg="http://schemas.microsoft.com/office/word/2010/wordprocessingGroup" xmlns:wpi="http://schemas.microsoft.com/office/word/2010/wordprocessingInk" xmlns:wps="http://schemas.microsoft.com/office/word/2010/wordprocessingShape" xmlns:o="urn:schemas-microsoft-com:office:office" xmlns:v="urn:schemas-microsoft-com:vml" xmlns:w10="urn:schemas-microsoft-com:office:word" xmlns:w="http://schemas.openxmlformats.org/wordprocessingml/2006/main" xmlns:w14="http://schemas.microsoft.com/office/word/2010/wordml" xmlns:w15="http://schemas.microsoft.com/office/word/2012/wordml" xmlns:w16cex="http://schemas.microsoft.com/office/word/2018/wordml/cex" xmlns:w16cid="http://schemas.microsoft.com/office/word/2016/wordml/cid" xmlns:w16="http://schemas.microsoft.com/office/word/2018/wordml" xmlns:w16sdtdh="http://schemas.microsoft.com/office/word/2020/wordml/sdtdatahash" xmlns:w16sdtfl="http://schemas.microsoft.com/office/word/2024/wordml/sdtformatlock" xmlns:w16se="http://schemas.microsoft.com/office/word/2015/wordml/symex" xmlns:w16du="http://schemas.microsoft.com/office/word/2023/wordml/word16du" xmlns:wne="http://schemas.microsoft.com/office/word/2006/wordml" mc:Ignorable="w14 w15 w16se w16cid w16 w16cex w16sdtdh w16sdtfl w16du wp14">
   <w:body>
     <w:p>
       <w:pPr>
@@ -37,8 +37,79 @@
           <w:sz w:val="26"/>
           <w:szCs w:val="26"/>
         </w:rPr>
-        <w:t>Online Shopping Store — Kiểm chứng phần mềm</w:t>
-      </w:r>
+        <w:t xml:space="preserve">Online Shopping Store — </w:t>
+      </w:r>
+      <w:proofErr w:type="spellStart"/>
+      <w:r>
+        <w:rPr>
+          <w:rFonts w:ascii="Times New Roman" w:hAnsi="Times New Roman" w:cs="Times New Roman"/>
+          <w:b/>
+          <w:sz w:val="26"/>
+          <w:szCs w:val="26"/>
+        </w:rPr>
+        <w:t>Kiểm</w:t>
+      </w:r>
+      <w:proofErr w:type="spellEnd"/>
+      <w:r>
+        <w:rPr>
+          <w:rFonts w:ascii="Times New Roman" w:hAnsi="Times New Roman" w:cs="Times New Roman"/>
+          <w:b/>
+          <w:sz w:val="26"/>
+          <w:szCs w:val="26"/>
+        </w:rPr>
+        <w:t xml:space="preserve"> </w:t>
+      </w:r>
+      <w:proofErr w:type="spellStart"/>
+      <w:r>
+        <w:rPr>
+          <w:rFonts w:ascii="Times New Roman" w:hAnsi="Times New Roman" w:cs="Times New Roman"/>
+          <w:b/>
+          <w:sz w:val="26"/>
+          <w:szCs w:val="26"/>
+        </w:rPr>
+        <w:t>chứng</w:t>
+      </w:r>
+      <w:proofErr w:type="spellEnd"/>
+      <w:r>
+        <w:rPr>
+          <w:rFonts w:ascii="Times New Roman" w:hAnsi="Times New Roman" w:cs="Times New Roman"/>
+          <w:b/>
+          <w:sz w:val="26"/>
+          <w:szCs w:val="26"/>
+        </w:rPr>
+        <w:t xml:space="preserve"> </w:t>
+      </w:r>
+      <w:proofErr w:type="spellStart"/>
+      <w:r>
+        <w:rPr>
+          <w:rFonts w:ascii="Times New Roman" w:hAnsi="Times New Roman" w:cs="Times New Roman"/>
+          <w:b/>
+          <w:sz w:val="26"/>
+          <w:szCs w:val="26"/>
+        </w:rPr>
+        <w:t>phần</w:t>
+      </w:r>
+      <w:proofErr w:type="spellEnd"/>
+      <w:r>
+        <w:rPr>
+          <w:rFonts w:ascii="Times New Roman" w:hAnsi="Times New Roman" w:cs="Times New Roman"/>
+          <w:b/>
+          <w:sz w:val="26"/>
+          <w:szCs w:val="26"/>
+        </w:rPr>
+        <w:t xml:space="preserve"> </w:t>
+      </w:r>
+      <w:proofErr w:type="spellStart"/>
+      <w:r>
+        <w:rPr>
+          <w:rFonts w:ascii="Times New Roman" w:hAnsi="Times New Roman" w:cs="Times New Roman"/>
+          <w:b/>
+          <w:sz w:val="26"/>
+          <w:szCs w:val="26"/>
+        </w:rPr>
+        <w:t>mềm</w:t>
+      </w:r>
+      <w:proofErr w:type="spellEnd"/>
     </w:p>
     <w:p>
       <w:pPr>
@@ -55,15 +126,219 @@
           <w:sz w:val="26"/>
           <w:szCs w:val="26"/>
         </w:rPr>
-        <w:t>File này CHỈ điền ở Tuần 4</w:t>
-      </w:r>
-      <w:r>
-        <w:rPr>
-          <w:rFonts w:ascii="Times New Roman" w:hAnsi="Times New Roman" w:cs="Times New Roman"/>
-          <w:sz w:val="26"/>
-          <w:szCs w:val="26"/>
-        </w:rPr>
-        <w:t xml:space="preserve">, sau khi đã có đủ dữ liệu từ Test_Execution_Report_FE.xlsx, Test_Execution_Report_API.xlsx, Bug_Report.xlsx. </w:t>
+        <w:t xml:space="preserve">File </w:t>
+      </w:r>
+      <w:proofErr w:type="spellStart"/>
+      <w:r>
+        <w:rPr>
+          <w:rFonts w:ascii="Times New Roman" w:hAnsi="Times New Roman" w:cs="Times New Roman"/>
+          <w:b/>
+          <w:sz w:val="26"/>
+          <w:szCs w:val="26"/>
+        </w:rPr>
+        <w:t>này</w:t>
+      </w:r>
+      <w:proofErr w:type="spellEnd"/>
+      <w:r>
+        <w:rPr>
+          <w:rFonts w:ascii="Times New Roman" w:hAnsi="Times New Roman" w:cs="Times New Roman"/>
+          <w:b/>
+          <w:sz w:val="26"/>
+          <w:szCs w:val="26"/>
+        </w:rPr>
+        <w:t xml:space="preserve"> CHỈ </w:t>
+      </w:r>
+      <w:proofErr w:type="spellStart"/>
+      <w:r>
+        <w:rPr>
+          <w:rFonts w:ascii="Times New Roman" w:hAnsi="Times New Roman" w:cs="Times New Roman"/>
+          <w:b/>
+          <w:sz w:val="26"/>
+          <w:szCs w:val="26"/>
+        </w:rPr>
+        <w:t>điền</w:t>
+      </w:r>
+      <w:proofErr w:type="spellEnd"/>
+      <w:r>
+        <w:rPr>
+          <w:rFonts w:ascii="Times New Roman" w:hAnsi="Times New Roman" w:cs="Times New Roman"/>
+          <w:b/>
+          <w:sz w:val="26"/>
+          <w:szCs w:val="26"/>
+        </w:rPr>
+        <w:t xml:space="preserve"> ở </w:t>
+      </w:r>
+      <w:proofErr w:type="spellStart"/>
+      <w:r>
+        <w:rPr>
+          <w:rFonts w:ascii="Times New Roman" w:hAnsi="Times New Roman" w:cs="Times New Roman"/>
+          <w:b/>
+          <w:sz w:val="26"/>
+          <w:szCs w:val="26"/>
+        </w:rPr>
+        <w:t>Tuần</w:t>
+      </w:r>
+      <w:proofErr w:type="spellEnd"/>
+      <w:r>
+        <w:rPr>
+          <w:rFonts w:ascii="Times New Roman" w:hAnsi="Times New Roman" w:cs="Times New Roman"/>
+          <w:b/>
+          <w:sz w:val="26"/>
+          <w:szCs w:val="26"/>
+        </w:rPr>
+        <w:t xml:space="preserve"> 4</w:t>
+      </w:r>
+      <w:r>
+        <w:rPr>
+          <w:rFonts w:ascii="Times New Roman" w:hAnsi="Times New Roman" w:cs="Times New Roman"/>
+          <w:sz w:val="26"/>
+          <w:szCs w:val="26"/>
+        </w:rPr>
+        <w:t xml:space="preserve">, </w:t>
+      </w:r>
+      <w:proofErr w:type="spellStart"/>
+      <w:r>
+        <w:rPr>
+          <w:rFonts w:ascii="Times New Roman" w:hAnsi="Times New Roman" w:cs="Times New Roman"/>
+          <w:sz w:val="26"/>
+          <w:szCs w:val="26"/>
+        </w:rPr>
+        <w:t>sau</w:t>
+      </w:r>
+      <w:proofErr w:type="spellEnd"/>
+      <w:r>
+        <w:rPr>
+          <w:rFonts w:ascii="Times New Roman" w:hAnsi="Times New Roman" w:cs="Times New Roman"/>
+          <w:sz w:val="26"/>
+          <w:szCs w:val="26"/>
+        </w:rPr>
+        <w:t xml:space="preserve"> </w:t>
+      </w:r>
+      <w:proofErr w:type="spellStart"/>
+      <w:r>
+        <w:rPr>
+          <w:rFonts w:ascii="Times New Roman" w:hAnsi="Times New Roman" w:cs="Times New Roman"/>
+          <w:sz w:val="26"/>
+          <w:szCs w:val="26"/>
+        </w:rPr>
+        <w:t>khi</w:t>
+      </w:r>
+      <w:proofErr w:type="spellEnd"/>
+      <w:r>
+        <w:rPr>
+          <w:rFonts w:ascii="Times New Roman" w:hAnsi="Times New Roman" w:cs="Times New Roman"/>
+          <w:sz w:val="26"/>
+          <w:szCs w:val="26"/>
+        </w:rPr>
+        <w:t xml:space="preserve"> </w:t>
+      </w:r>
+      <w:proofErr w:type="spellStart"/>
+      <w:r>
+        <w:rPr>
+          <w:rFonts w:ascii="Times New Roman" w:hAnsi="Times New Roman" w:cs="Times New Roman"/>
+          <w:sz w:val="26"/>
+          <w:szCs w:val="26"/>
+        </w:rPr>
+        <w:t>đã</w:t>
+      </w:r>
+      <w:proofErr w:type="spellEnd"/>
+      <w:r>
+        <w:rPr>
+          <w:rFonts w:ascii="Times New Roman" w:hAnsi="Times New Roman" w:cs="Times New Roman"/>
+          <w:sz w:val="26"/>
+          <w:szCs w:val="26"/>
+        </w:rPr>
+        <w:t xml:space="preserve"> </w:t>
+      </w:r>
+      <w:proofErr w:type="spellStart"/>
+      <w:r>
+        <w:rPr>
+          <w:rFonts w:ascii="Times New Roman" w:hAnsi="Times New Roman" w:cs="Times New Roman"/>
+          <w:sz w:val="26"/>
+          <w:szCs w:val="26"/>
+        </w:rPr>
+        <w:t>có</w:t>
+      </w:r>
+      <w:proofErr w:type="spellEnd"/>
+      <w:r>
+        <w:rPr>
+          <w:rFonts w:ascii="Times New Roman" w:hAnsi="Times New Roman" w:cs="Times New Roman"/>
+          <w:sz w:val="26"/>
+          <w:szCs w:val="26"/>
+        </w:rPr>
+        <w:t xml:space="preserve"> </w:t>
+      </w:r>
+      <w:proofErr w:type="spellStart"/>
+      <w:r>
+        <w:rPr>
+          <w:rFonts w:ascii="Times New Roman" w:hAnsi="Times New Roman" w:cs="Times New Roman"/>
+          <w:sz w:val="26"/>
+          <w:szCs w:val="26"/>
+        </w:rPr>
+        <w:t>đủ</w:t>
+      </w:r>
+      <w:proofErr w:type="spellEnd"/>
+      <w:r>
+        <w:rPr>
+          <w:rFonts w:ascii="Times New Roman" w:hAnsi="Times New Roman" w:cs="Times New Roman"/>
+          <w:sz w:val="26"/>
+          <w:szCs w:val="26"/>
+        </w:rPr>
+        <w:t xml:space="preserve"> </w:t>
+      </w:r>
+      <w:proofErr w:type="spellStart"/>
+      <w:r>
+        <w:rPr>
+          <w:rFonts w:ascii="Times New Roman" w:hAnsi="Times New Roman" w:cs="Times New Roman"/>
+          <w:sz w:val="26"/>
+          <w:szCs w:val="26"/>
+        </w:rPr>
+        <w:t>dữ</w:t>
+      </w:r>
+      <w:proofErr w:type="spellEnd"/>
+      <w:r>
+        <w:rPr>
+          <w:rFonts w:ascii="Times New Roman" w:hAnsi="Times New Roman" w:cs="Times New Roman"/>
+          <w:sz w:val="26"/>
+          <w:szCs w:val="26"/>
+        </w:rPr>
+        <w:t xml:space="preserve"> </w:t>
+      </w:r>
+      <w:proofErr w:type="spellStart"/>
+      <w:r>
+        <w:rPr>
+          <w:rFonts w:ascii="Times New Roman" w:hAnsi="Times New Roman" w:cs="Times New Roman"/>
+          <w:sz w:val="26"/>
+          <w:szCs w:val="26"/>
+        </w:rPr>
+        <w:t>liệu</w:t>
+      </w:r>
+      <w:proofErr w:type="spellEnd"/>
+      <w:r>
+        <w:rPr>
+          <w:rFonts w:ascii="Times New Roman" w:hAnsi="Times New Roman" w:cs="Times New Roman"/>
+          <w:sz w:val="26"/>
+          <w:szCs w:val="26"/>
+        </w:rPr>
+        <w:t xml:space="preserve"> </w:t>
+      </w:r>
+      <w:proofErr w:type="spellStart"/>
+      <w:r>
+        <w:rPr>
+          <w:rFonts w:ascii="Times New Roman" w:hAnsi="Times New Roman" w:cs="Times New Roman"/>
+          <w:sz w:val="26"/>
+          <w:szCs w:val="26"/>
+        </w:rPr>
+        <w:t>từ</w:t>
+      </w:r>
+      <w:proofErr w:type="spellEnd"/>
+      <w:r>
+        <w:rPr>
+          <w:rFonts w:ascii="Times New Roman" w:hAnsi="Times New Roman" w:cs="Times New Roman"/>
+          <w:sz w:val="26"/>
+          <w:szCs w:val="26"/>
+        </w:rPr>
+        <w:t xml:space="preserve"> Test_Execution_Report_FE.xlsx, Test_Execution_Report_API.xlsx, Bug_Report.xlsx. </w:t>
       </w:r>
     </w:p>
     <w:p>
@@ -77,8 +352,30 @@
         <w:rPr>
           <w:szCs w:val="26"/>
         </w:rPr>
-        <w:t>1. Tổng quan</w:t>
-      </w:r>
+        <w:t xml:space="preserve">1. </w:t>
+      </w:r>
+      <w:proofErr w:type="spellStart"/>
+      <w:r>
+        <w:rPr>
+          <w:szCs w:val="26"/>
+        </w:rPr>
+        <w:t>Tổng</w:t>
+      </w:r>
+      <w:proofErr w:type="spellEnd"/>
+      <w:r>
+        <w:rPr>
+          <w:szCs w:val="26"/>
+        </w:rPr>
+        <w:t xml:space="preserve"> </w:t>
+      </w:r>
+      <w:proofErr w:type="spellStart"/>
+      <w:r>
+        <w:rPr>
+          <w:szCs w:val="26"/>
+        </w:rPr>
+        <w:t>quan</w:t>
+      </w:r>
+      <w:proofErr w:type="spellEnd"/>
     </w:p>
     <w:p>
       <w:pPr>
@@ -88,13 +385,131 @@
           <w:szCs w:val="26"/>
         </w:rPr>
       </w:pPr>
-      <w:r>
-        <w:rPr>
-          <w:rFonts w:ascii="Times New Roman" w:hAnsi="Times New Roman" w:cs="Times New Roman"/>
-          <w:sz w:val="26"/>
-          <w:szCs w:val="26"/>
-        </w:rPr>
-        <w:t>Thời gian test: 12/08 – 25/08 (và kéo dài nếu cần)</w:t>
+      <w:proofErr w:type="spellStart"/>
+      <w:r>
+        <w:rPr>
+          <w:rFonts w:ascii="Times New Roman" w:hAnsi="Times New Roman" w:cs="Times New Roman"/>
+          <w:sz w:val="26"/>
+          <w:szCs w:val="26"/>
+        </w:rPr>
+        <w:t>Thời</w:t>
+      </w:r>
+      <w:proofErr w:type="spellEnd"/>
+      <w:r>
+        <w:rPr>
+          <w:rFonts w:ascii="Times New Roman" w:hAnsi="Times New Roman" w:cs="Times New Roman"/>
+          <w:sz w:val="26"/>
+          <w:szCs w:val="26"/>
+        </w:rPr>
+        <w:t xml:space="preserve"> </w:t>
+      </w:r>
+      <w:proofErr w:type="spellStart"/>
+      <w:r>
+        <w:rPr>
+          <w:rFonts w:ascii="Times New Roman" w:hAnsi="Times New Roman" w:cs="Times New Roman"/>
+          <w:sz w:val="26"/>
+          <w:szCs w:val="26"/>
+        </w:rPr>
+        <w:t>gian</w:t>
+      </w:r>
+      <w:proofErr w:type="spellEnd"/>
+      <w:r>
+        <w:rPr>
+          <w:rFonts w:ascii="Times New Roman" w:hAnsi="Times New Roman" w:cs="Times New Roman"/>
+          <w:sz w:val="26"/>
+          <w:szCs w:val="26"/>
+        </w:rPr>
+        <w:t xml:space="preserve"> test: 12/08 – 25/08 (</w:t>
+      </w:r>
+      <w:proofErr w:type="spellStart"/>
+      <w:r>
+        <w:rPr>
+          <w:rFonts w:ascii="Times New Roman" w:hAnsi="Times New Roman" w:cs="Times New Roman"/>
+          <w:sz w:val="26"/>
+          <w:szCs w:val="26"/>
+        </w:rPr>
+        <w:t>và</w:t>
+      </w:r>
+      <w:proofErr w:type="spellEnd"/>
+      <w:r>
+        <w:rPr>
+          <w:rFonts w:ascii="Times New Roman" w:hAnsi="Times New Roman" w:cs="Times New Roman"/>
+          <w:sz w:val="26"/>
+          <w:szCs w:val="26"/>
+        </w:rPr>
+        <w:t xml:space="preserve"> </w:t>
+      </w:r>
+      <w:proofErr w:type="spellStart"/>
+      <w:r>
+        <w:rPr>
+          <w:rFonts w:ascii="Times New Roman" w:hAnsi="Times New Roman" w:cs="Times New Roman"/>
+          <w:sz w:val="26"/>
+          <w:szCs w:val="26"/>
+        </w:rPr>
+        <w:t>kéo</w:t>
+      </w:r>
+      <w:proofErr w:type="spellEnd"/>
+      <w:r>
+        <w:rPr>
+          <w:rFonts w:ascii="Times New Roman" w:hAnsi="Times New Roman" w:cs="Times New Roman"/>
+          <w:sz w:val="26"/>
+          <w:szCs w:val="26"/>
+        </w:rPr>
+        <w:t xml:space="preserve"> </w:t>
+      </w:r>
+      <w:proofErr w:type="spellStart"/>
+      <w:r>
+        <w:rPr>
+          <w:rFonts w:ascii="Times New Roman" w:hAnsi="Times New Roman" w:cs="Times New Roman"/>
+          <w:sz w:val="26"/>
+          <w:szCs w:val="26"/>
+        </w:rPr>
+        <w:t>dài</w:t>
+      </w:r>
+      <w:proofErr w:type="spellEnd"/>
+      <w:r>
+        <w:rPr>
+          <w:rFonts w:ascii="Times New Roman" w:hAnsi="Times New Roman" w:cs="Times New Roman"/>
+          <w:sz w:val="26"/>
+          <w:szCs w:val="26"/>
+        </w:rPr>
+        <w:t xml:space="preserve"> </w:t>
+      </w:r>
+      <w:proofErr w:type="spellStart"/>
+      <w:r>
+        <w:rPr>
+          <w:rFonts w:ascii="Times New Roman" w:hAnsi="Times New Roman" w:cs="Times New Roman"/>
+          <w:sz w:val="26"/>
+          <w:szCs w:val="26"/>
+        </w:rPr>
+        <w:t>nếu</w:t>
+      </w:r>
+      <w:proofErr w:type="spellEnd"/>
+      <w:r>
+        <w:rPr>
+          <w:rFonts w:ascii="Times New Roman" w:hAnsi="Times New Roman" w:cs="Times New Roman"/>
+          <w:sz w:val="26"/>
+          <w:szCs w:val="26"/>
+        </w:rPr>
+        <w:t xml:space="preserve"> </w:t>
+      </w:r>
+      <w:proofErr w:type="spellStart"/>
+      <w:r>
+        <w:rPr>
+          <w:rFonts w:ascii="Times New Roman" w:hAnsi="Times New Roman" w:cs="Times New Roman"/>
+          <w:sz w:val="26"/>
+          <w:szCs w:val="26"/>
+        </w:rPr>
+        <w:t>cần</w:t>
+      </w:r>
+      <w:proofErr w:type="spellEnd"/>
+      <w:r>
+        <w:rPr>
+          <w:rFonts w:ascii="Times New Roman" w:hAnsi="Times New Roman" w:cs="Times New Roman"/>
+          <w:sz w:val="26"/>
+          <w:szCs w:val="26"/>
+        </w:rPr>
+        <w:t>)</w:t>
       </w:r>
     </w:p>
     <w:p>
@@ -111,7 +526,43 @@
           <w:sz w:val="26"/>
           <w:szCs w:val="26"/>
         </w:rPr>
-        <w:t>Phạm vi: 5 module — FE Manual + API (Postman/Newman) + E2E CodeceptJS + Unit Test</w:t>
+        <w:t xml:space="preserve">Phạm vi: 5 </w:t>
+      </w:r>
+      <w:proofErr w:type="gramStart"/>
+      <w:r>
+        <w:rPr>
+          <w:rFonts w:ascii="Times New Roman" w:hAnsi="Times New Roman" w:cs="Times New Roman"/>
+          <w:sz w:val="26"/>
+          <w:szCs w:val="26"/>
+        </w:rPr>
+        <w:t>module</w:t>
+      </w:r>
+      <w:proofErr w:type="gramEnd"/>
+      <w:r>
+        <w:rPr>
+          <w:rFonts w:ascii="Times New Roman" w:hAnsi="Times New Roman" w:cs="Times New Roman"/>
+          <w:sz w:val="26"/>
+          <w:szCs w:val="26"/>
+        </w:rPr>
+        <w:t xml:space="preserve"> — FE Manual + API (Postman/Newman) + E2E </w:t>
+      </w:r>
+      <w:proofErr w:type="spellStart"/>
+      <w:r>
+        <w:rPr>
+          <w:rFonts w:ascii="Times New Roman" w:hAnsi="Times New Roman" w:cs="Times New Roman"/>
+          <w:sz w:val="26"/>
+          <w:szCs w:val="26"/>
+        </w:rPr>
+        <w:t>CodeceptJS</w:t>
+      </w:r>
+      <w:proofErr w:type="spellEnd"/>
+      <w:r>
+        <w:rPr>
+          <w:rFonts w:ascii="Times New Roman" w:hAnsi="Times New Roman" w:cs="Times New Roman"/>
+          <w:sz w:val="26"/>
+          <w:szCs w:val="26"/>
+        </w:rPr>
+        <w:t xml:space="preserve"> + Unit Test</w:t>
       </w:r>
     </w:p>
     <w:p>
@@ -122,13 +573,95 @@
           <w:szCs w:val="26"/>
         </w:rPr>
       </w:pPr>
-      <w:r>
-        <w:rPr>
-          <w:rFonts w:ascii="Times New Roman" w:hAnsi="Times New Roman" w:cs="Times New Roman"/>
-          <w:sz w:val="26"/>
-          <w:szCs w:val="26"/>
-        </w:rPr>
-        <w:t>Tổng số Test Case đã thực thi:</w:t>
+      <w:proofErr w:type="spellStart"/>
+      <w:r>
+        <w:rPr>
+          <w:rFonts w:ascii="Times New Roman" w:hAnsi="Times New Roman" w:cs="Times New Roman"/>
+          <w:sz w:val="26"/>
+          <w:szCs w:val="26"/>
+        </w:rPr>
+        <w:t>Tổng</w:t>
+      </w:r>
+      <w:proofErr w:type="spellEnd"/>
+      <w:r>
+        <w:rPr>
+          <w:rFonts w:ascii="Times New Roman" w:hAnsi="Times New Roman" w:cs="Times New Roman"/>
+          <w:sz w:val="26"/>
+          <w:szCs w:val="26"/>
+        </w:rPr>
+        <w:t xml:space="preserve"> </w:t>
+      </w:r>
+      <w:proofErr w:type="spellStart"/>
+      <w:r>
+        <w:rPr>
+          <w:rFonts w:ascii="Times New Roman" w:hAnsi="Times New Roman" w:cs="Times New Roman"/>
+          <w:sz w:val="26"/>
+          <w:szCs w:val="26"/>
+        </w:rPr>
+        <w:t>số</w:t>
+      </w:r>
+      <w:proofErr w:type="spellEnd"/>
+      <w:r>
+        <w:rPr>
+          <w:rFonts w:ascii="Times New Roman" w:hAnsi="Times New Roman" w:cs="Times New Roman"/>
+          <w:sz w:val="26"/>
+          <w:szCs w:val="26"/>
+        </w:rPr>
+        <w:t xml:space="preserve"> Test Case </w:t>
+      </w:r>
+      <w:proofErr w:type="spellStart"/>
+      <w:r>
+        <w:rPr>
+          <w:rFonts w:ascii="Times New Roman" w:hAnsi="Times New Roman" w:cs="Times New Roman"/>
+          <w:sz w:val="26"/>
+          <w:szCs w:val="26"/>
+        </w:rPr>
+        <w:t>đã</w:t>
+      </w:r>
+      <w:proofErr w:type="spellEnd"/>
+      <w:r>
+        <w:rPr>
+          <w:rFonts w:ascii="Times New Roman" w:hAnsi="Times New Roman" w:cs="Times New Roman"/>
+          <w:sz w:val="26"/>
+          <w:szCs w:val="26"/>
+        </w:rPr>
+        <w:t xml:space="preserve"> </w:t>
+      </w:r>
+      <w:proofErr w:type="spellStart"/>
+      <w:r>
+        <w:rPr>
+          <w:rFonts w:ascii="Times New Roman" w:hAnsi="Times New Roman" w:cs="Times New Roman"/>
+          <w:sz w:val="26"/>
+          <w:szCs w:val="26"/>
+        </w:rPr>
+        <w:t>thực</w:t>
+      </w:r>
+      <w:proofErr w:type="spellEnd"/>
+      <w:r>
+        <w:rPr>
+          <w:rFonts w:ascii="Times New Roman" w:hAnsi="Times New Roman" w:cs="Times New Roman"/>
+          <w:sz w:val="26"/>
+          <w:szCs w:val="26"/>
+        </w:rPr>
+        <w:t xml:space="preserve"> </w:t>
+      </w:r>
+      <w:proofErr w:type="spellStart"/>
+      <w:r>
+        <w:rPr>
+          <w:rFonts w:ascii="Times New Roman" w:hAnsi="Times New Roman" w:cs="Times New Roman"/>
+          <w:sz w:val="26"/>
+          <w:szCs w:val="26"/>
+        </w:rPr>
+        <w:t>thi</w:t>
+      </w:r>
+      <w:proofErr w:type="spellEnd"/>
+      <w:r>
+        <w:rPr>
+          <w:rFonts w:ascii="Times New Roman" w:hAnsi="Times New Roman" w:cs="Times New Roman"/>
+          <w:sz w:val="26"/>
+          <w:szCs w:val="26"/>
+        </w:rPr>
+        <w:t>:</w:t>
       </w:r>
     </w:p>
     <w:p>
@@ -170,7 +703,79 @@
           <w:sz w:val="26"/>
           <w:szCs w:val="26"/>
         </w:rPr>
-        <w:t>API (Newman): 161 requests – phần assertion FAIL khớp các bug đã log (SCRUM-46, 47, 48, 51, 58, 59, 66–72…)</w:t>
+        <w:t xml:space="preserve">API (Newman): 161 requests – </w:t>
+      </w:r>
+      <w:proofErr w:type="spellStart"/>
+      <w:r>
+        <w:rPr>
+          <w:rFonts w:ascii="Times New Roman" w:hAnsi="Times New Roman" w:cs="Times New Roman"/>
+          <w:sz w:val="26"/>
+          <w:szCs w:val="26"/>
+        </w:rPr>
+        <w:t>phần</w:t>
+      </w:r>
+      <w:proofErr w:type="spellEnd"/>
+      <w:r>
+        <w:rPr>
+          <w:rFonts w:ascii="Times New Roman" w:hAnsi="Times New Roman" w:cs="Times New Roman"/>
+          <w:sz w:val="26"/>
+          <w:szCs w:val="26"/>
+        </w:rPr>
+        <w:t xml:space="preserve"> assertion FAIL </w:t>
+      </w:r>
+      <w:proofErr w:type="spellStart"/>
+      <w:r>
+        <w:rPr>
+          <w:rFonts w:ascii="Times New Roman" w:hAnsi="Times New Roman" w:cs="Times New Roman"/>
+          <w:sz w:val="26"/>
+          <w:szCs w:val="26"/>
+        </w:rPr>
+        <w:t>khớp</w:t>
+      </w:r>
+      <w:proofErr w:type="spellEnd"/>
+      <w:r>
+        <w:rPr>
+          <w:rFonts w:ascii="Times New Roman" w:hAnsi="Times New Roman" w:cs="Times New Roman"/>
+          <w:sz w:val="26"/>
+          <w:szCs w:val="26"/>
+        </w:rPr>
+        <w:t xml:space="preserve"> </w:t>
+      </w:r>
+      <w:proofErr w:type="spellStart"/>
+      <w:r>
+        <w:rPr>
+          <w:rFonts w:ascii="Times New Roman" w:hAnsi="Times New Roman" w:cs="Times New Roman"/>
+          <w:sz w:val="26"/>
+          <w:szCs w:val="26"/>
+        </w:rPr>
+        <w:t>các</w:t>
+      </w:r>
+      <w:proofErr w:type="spellEnd"/>
+      <w:r>
+        <w:rPr>
+          <w:rFonts w:ascii="Times New Roman" w:hAnsi="Times New Roman" w:cs="Times New Roman"/>
+          <w:sz w:val="26"/>
+          <w:szCs w:val="26"/>
+        </w:rPr>
+        <w:t xml:space="preserve"> bug </w:t>
+      </w:r>
+      <w:proofErr w:type="spellStart"/>
+      <w:r>
+        <w:rPr>
+          <w:rFonts w:ascii="Times New Roman" w:hAnsi="Times New Roman" w:cs="Times New Roman"/>
+          <w:sz w:val="26"/>
+          <w:szCs w:val="26"/>
+        </w:rPr>
+        <w:t>đã</w:t>
+      </w:r>
+      <w:proofErr w:type="spellEnd"/>
+      <w:r>
+        <w:rPr>
+          <w:rFonts w:ascii="Times New Roman" w:hAnsi="Times New Roman" w:cs="Times New Roman"/>
+          <w:sz w:val="26"/>
+          <w:szCs w:val="26"/>
+        </w:rPr>
+        <w:t xml:space="preserve"> log (SCRUM-46, 47, 48, 51, 58, 59, 66–72…)</w:t>
       </w:r>
     </w:p>
     <w:p>
@@ -228,7 +833,25 @@
           <w:sz w:val="26"/>
           <w:szCs w:val="26"/>
         </w:rPr>
-        <w:t>+ CodeceptJS: 5 scenario (2 Pass / 3 Fail)</w:t>
+        <w:t xml:space="preserve">+ </w:t>
+      </w:r>
+      <w:proofErr w:type="spellStart"/>
+      <w:r>
+        <w:rPr>
+          <w:rFonts w:ascii="Times New Roman" w:hAnsi="Times New Roman" w:cs="Times New Roman"/>
+          <w:sz w:val="26"/>
+          <w:szCs w:val="26"/>
+        </w:rPr>
+        <w:t>CodeceptJS</w:t>
+      </w:r>
+      <w:proofErr w:type="spellEnd"/>
+      <w:r>
+        <w:rPr>
+          <w:rFonts w:ascii="Times New Roman" w:hAnsi="Times New Roman" w:cs="Times New Roman"/>
+          <w:sz w:val="26"/>
+          <w:szCs w:val="26"/>
+        </w:rPr>
+        <w:t>: 5 scenario (2 Pass / 3 Fail)</w:t>
       </w:r>
       <w:r>
         <w:rPr>
@@ -280,8 +903,54 @@
           <w:sz w:val="26"/>
           <w:szCs w:val="26"/>
         </w:rPr>
-        <w:t>2 Fail = assertion/test data (TC_FE_CUS_CART_01, TC_FE_CUS_CHK_01) – không mở bug mới</w:t>
-      </w:r>
+        <w:t xml:space="preserve">2 Fail = assertion/test data (TC_FE_CUS_CART_01, TC_FE_CUS_CHK_01) – </w:t>
+      </w:r>
+      <w:proofErr w:type="spellStart"/>
+      <w:r>
+        <w:rPr>
+          <w:rFonts w:ascii="Times New Roman" w:hAnsi="Times New Roman" w:cs="Times New Roman"/>
+          <w:sz w:val="26"/>
+          <w:szCs w:val="26"/>
+        </w:rPr>
+        <w:t>không</w:t>
+      </w:r>
+      <w:proofErr w:type="spellEnd"/>
+      <w:r>
+        <w:rPr>
+          <w:rFonts w:ascii="Times New Roman" w:hAnsi="Times New Roman" w:cs="Times New Roman"/>
+          <w:sz w:val="26"/>
+          <w:szCs w:val="26"/>
+        </w:rPr>
+        <w:t xml:space="preserve"> </w:t>
+      </w:r>
+      <w:proofErr w:type="spellStart"/>
+      <w:r>
+        <w:rPr>
+          <w:rFonts w:ascii="Times New Roman" w:hAnsi="Times New Roman" w:cs="Times New Roman"/>
+          <w:sz w:val="26"/>
+          <w:szCs w:val="26"/>
+        </w:rPr>
+        <w:t>mở</w:t>
+      </w:r>
+      <w:proofErr w:type="spellEnd"/>
+      <w:r>
+        <w:rPr>
+          <w:rFonts w:ascii="Times New Roman" w:hAnsi="Times New Roman" w:cs="Times New Roman"/>
+          <w:sz w:val="26"/>
+          <w:szCs w:val="26"/>
+        </w:rPr>
+        <w:t xml:space="preserve"> bug </w:t>
+      </w:r>
+      <w:proofErr w:type="spellStart"/>
+      <w:r>
+        <w:rPr>
+          <w:rFonts w:ascii="Times New Roman" w:hAnsi="Times New Roman" w:cs="Times New Roman"/>
+          <w:sz w:val="26"/>
+          <w:szCs w:val="26"/>
+        </w:rPr>
+        <w:t>mới</w:t>
+      </w:r>
+      <w:proofErr w:type="spellEnd"/>
     </w:p>
     <w:p>
       <w:pPr>
@@ -294,7 +963,77 @@
         <w:rPr>
           <w:szCs w:val="26"/>
         </w:rPr>
-        <w:t>2. Kết quả tổng hợp theo module</w:t>
+        <w:t xml:space="preserve">2. </w:t>
+      </w:r>
+      <w:proofErr w:type="spellStart"/>
+      <w:r>
+        <w:rPr>
+          <w:szCs w:val="26"/>
+        </w:rPr>
+        <w:t>Kết</w:t>
+      </w:r>
+      <w:proofErr w:type="spellEnd"/>
+      <w:r>
+        <w:rPr>
+          <w:szCs w:val="26"/>
+        </w:rPr>
+        <w:t xml:space="preserve"> </w:t>
+      </w:r>
+      <w:proofErr w:type="spellStart"/>
+      <w:r>
+        <w:rPr>
+          <w:szCs w:val="26"/>
+        </w:rPr>
+        <w:t>quả</w:t>
+      </w:r>
+      <w:proofErr w:type="spellEnd"/>
+      <w:r>
+        <w:rPr>
+          <w:szCs w:val="26"/>
+        </w:rPr>
+        <w:t xml:space="preserve"> </w:t>
+      </w:r>
+      <w:proofErr w:type="spellStart"/>
+      <w:r>
+        <w:rPr>
+          <w:szCs w:val="26"/>
+        </w:rPr>
+        <w:t>tổng</w:t>
+      </w:r>
+      <w:proofErr w:type="spellEnd"/>
+      <w:r>
+        <w:rPr>
+          <w:szCs w:val="26"/>
+        </w:rPr>
+        <w:t xml:space="preserve"> </w:t>
+      </w:r>
+      <w:proofErr w:type="spellStart"/>
+      <w:r>
+        <w:rPr>
+          <w:szCs w:val="26"/>
+        </w:rPr>
+        <w:t>hợp</w:t>
+      </w:r>
+      <w:proofErr w:type="spellEnd"/>
+      <w:r>
+        <w:rPr>
+          <w:szCs w:val="26"/>
+        </w:rPr>
+        <w:t xml:space="preserve"> </w:t>
+      </w:r>
+      <w:proofErr w:type="spellStart"/>
+      <w:r>
+        <w:rPr>
+          <w:szCs w:val="26"/>
+        </w:rPr>
+        <w:t>theo</w:t>
+      </w:r>
+      <w:proofErr w:type="spellEnd"/>
+      <w:r>
+        <w:rPr>
+          <w:szCs w:val="26"/>
+        </w:rPr>
+        <w:t xml:space="preserve"> module</w:t>
       </w:r>
     </w:p>
     <w:tbl>
@@ -322,6 +1061,7 @@
                 <w:szCs w:val="26"/>
               </w:rPr>
             </w:pPr>
+            <w:proofErr w:type="spellStart"/>
             <w:r>
               <w:rPr>
                 <w:rFonts w:ascii="Times New Roman" w:hAnsi="Times New Roman" w:cs="Times New Roman"/>
@@ -330,6 +1070,7 @@
               </w:rPr>
               <w:t>Nhóm</w:t>
             </w:r>
+            <w:proofErr w:type="spellEnd"/>
           </w:p>
         </w:tc>
         <w:tc>
@@ -351,8 +1092,18 @@
                 <w:sz w:val="26"/>
                 <w:szCs w:val="26"/>
               </w:rPr>
-              <w:t>Quy mô</w:t>
-            </w:r>
+              <w:t xml:space="preserve">Quy </w:t>
+            </w:r>
+            <w:proofErr w:type="spellStart"/>
+            <w:r>
+              <w:rPr>
+                <w:rFonts w:ascii="Times New Roman" w:hAnsi="Times New Roman" w:cs="Times New Roman"/>
+                <w:sz w:val="26"/>
+                <w:szCs w:val="26"/>
+              </w:rPr>
+              <w:t>mô</w:t>
+            </w:r>
+            <w:proofErr w:type="spellEnd"/>
           </w:p>
         </w:tc>
         <w:tc>
@@ -374,7 +1125,43 @@
                 <w:sz w:val="26"/>
                 <w:szCs w:val="26"/>
               </w:rPr>
-              <w:t>Pass / Fail (tóm tắt)</w:t>
+              <w:t>Pass / Fail (</w:t>
+            </w:r>
+            <w:proofErr w:type="spellStart"/>
+            <w:r>
+              <w:rPr>
+                <w:rFonts w:ascii="Times New Roman" w:hAnsi="Times New Roman" w:cs="Times New Roman"/>
+                <w:sz w:val="26"/>
+                <w:szCs w:val="26"/>
+              </w:rPr>
+              <w:t>tóm</w:t>
+            </w:r>
+            <w:proofErr w:type="spellEnd"/>
+            <w:r>
+              <w:rPr>
+                <w:rFonts w:ascii="Times New Roman" w:hAnsi="Times New Roman" w:cs="Times New Roman"/>
+                <w:sz w:val="26"/>
+                <w:szCs w:val="26"/>
+              </w:rPr>
+              <w:t xml:space="preserve"> </w:t>
+            </w:r>
+            <w:proofErr w:type="spellStart"/>
+            <w:r>
+              <w:rPr>
+                <w:rFonts w:ascii="Times New Roman" w:hAnsi="Times New Roman" w:cs="Times New Roman"/>
+                <w:sz w:val="26"/>
+                <w:szCs w:val="26"/>
+              </w:rPr>
+              <w:t>tắt</w:t>
+            </w:r>
+            <w:proofErr w:type="spellEnd"/>
+            <w:r>
+              <w:rPr>
+                <w:rFonts w:ascii="Times New Roman" w:hAnsi="Times New Roman" w:cs="Times New Roman"/>
+                <w:sz w:val="26"/>
+                <w:szCs w:val="26"/>
+              </w:rPr>
+              <w:t>)</w:t>
             </w:r>
           </w:p>
         </w:tc>
@@ -445,7 +1232,25 @@
                 <w:sz w:val="26"/>
                 <w:szCs w:val="26"/>
               </w:rPr>
-              <w:t>3 FAIL chính: SCRUM-43, 44, 45 (+ typo 52)</w:t>
+              <w:t xml:space="preserve">3 FAIL </w:t>
+            </w:r>
+            <w:proofErr w:type="spellStart"/>
+            <w:r>
+              <w:rPr>
+                <w:rFonts w:ascii="Times New Roman" w:hAnsi="Times New Roman" w:cs="Times New Roman"/>
+                <w:sz w:val="26"/>
+                <w:szCs w:val="26"/>
+              </w:rPr>
+              <w:t>chính</w:t>
+            </w:r>
+            <w:proofErr w:type="spellEnd"/>
+            <w:r>
+              <w:rPr>
+                <w:rFonts w:ascii="Times New Roman" w:hAnsi="Times New Roman" w:cs="Times New Roman"/>
+                <w:sz w:val="26"/>
+                <w:szCs w:val="26"/>
+              </w:rPr>
+              <w:t>: SCRUM-43, 44, 45 (+ typo 52)</w:t>
             </w:r>
           </w:p>
         </w:tc>
@@ -581,13 +1386,77 @@
                 <w:szCs w:val="26"/>
               </w:rPr>
             </w:pPr>
-            <w:r>
-              <w:rPr>
-                <w:rFonts w:ascii="Times New Roman" w:hAnsi="Times New Roman" w:cs="Times New Roman"/>
-                <w:sz w:val="26"/>
-                <w:szCs w:val="26"/>
-              </w:rPr>
-              <w:t>Đa số PASS; FAIL chủ yếu ở Robustness</w:t>
+            <w:proofErr w:type="spellStart"/>
+            <w:r>
+              <w:rPr>
+                <w:rFonts w:ascii="Times New Roman" w:hAnsi="Times New Roman" w:cs="Times New Roman"/>
+                <w:sz w:val="26"/>
+                <w:szCs w:val="26"/>
+              </w:rPr>
+              <w:t>Đa</w:t>
+            </w:r>
+            <w:proofErr w:type="spellEnd"/>
+            <w:r>
+              <w:rPr>
+                <w:rFonts w:ascii="Times New Roman" w:hAnsi="Times New Roman" w:cs="Times New Roman"/>
+                <w:sz w:val="26"/>
+                <w:szCs w:val="26"/>
+              </w:rPr>
+              <w:t xml:space="preserve"> </w:t>
+            </w:r>
+            <w:proofErr w:type="spellStart"/>
+            <w:r>
+              <w:rPr>
+                <w:rFonts w:ascii="Times New Roman" w:hAnsi="Times New Roman" w:cs="Times New Roman"/>
+                <w:sz w:val="26"/>
+                <w:szCs w:val="26"/>
+              </w:rPr>
+              <w:t>số</w:t>
+            </w:r>
+            <w:proofErr w:type="spellEnd"/>
+            <w:r>
+              <w:rPr>
+                <w:rFonts w:ascii="Times New Roman" w:hAnsi="Times New Roman" w:cs="Times New Roman"/>
+                <w:sz w:val="26"/>
+                <w:szCs w:val="26"/>
+              </w:rPr>
+              <w:t xml:space="preserve"> PASS; FAIL </w:t>
+            </w:r>
+            <w:proofErr w:type="spellStart"/>
+            <w:r>
+              <w:rPr>
+                <w:rFonts w:ascii="Times New Roman" w:hAnsi="Times New Roman" w:cs="Times New Roman"/>
+                <w:sz w:val="26"/>
+                <w:szCs w:val="26"/>
+              </w:rPr>
+              <w:t>chủ</w:t>
+            </w:r>
+            <w:proofErr w:type="spellEnd"/>
+            <w:r>
+              <w:rPr>
+                <w:rFonts w:ascii="Times New Roman" w:hAnsi="Times New Roman" w:cs="Times New Roman"/>
+                <w:sz w:val="26"/>
+                <w:szCs w:val="26"/>
+              </w:rPr>
+              <w:t xml:space="preserve"> </w:t>
+            </w:r>
+            <w:proofErr w:type="spellStart"/>
+            <w:r>
+              <w:rPr>
+                <w:rFonts w:ascii="Times New Roman" w:hAnsi="Times New Roman" w:cs="Times New Roman"/>
+                <w:sz w:val="26"/>
+                <w:szCs w:val="26"/>
+              </w:rPr>
+              <w:t>yếu</w:t>
+            </w:r>
+            <w:proofErr w:type="spellEnd"/>
+            <w:r>
+              <w:rPr>
+                <w:rFonts w:ascii="Times New Roman" w:hAnsi="Times New Roman" w:cs="Times New Roman"/>
+                <w:sz w:val="26"/>
+                <w:szCs w:val="26"/>
+              </w:rPr>
+              <w:t xml:space="preserve"> ở Robustness</w:t>
             </w:r>
           </w:p>
         </w:tc>
@@ -729,8 +1598,18 @@
                 <w:sz w:val="26"/>
                 <w:szCs w:val="26"/>
               </w:rPr>
-              <w:t>32 PASS</w:t>
-            </w:r>
+              <w:t xml:space="preserve">32 </w:t>
+            </w:r>
+            <w:proofErr w:type="gramStart"/>
+            <w:r>
+              <w:rPr>
+                <w:rFonts w:ascii="Times New Roman" w:hAnsi="Times New Roman" w:cs="Times New Roman"/>
+                <w:sz w:val="26"/>
+                <w:szCs w:val="26"/>
+              </w:rPr>
+              <w:t>PASS</w:t>
+            </w:r>
+            <w:proofErr w:type="gramEnd"/>
           </w:p>
         </w:tc>
       </w:tr>
@@ -887,10 +1766,28 @@
                 <w:sz w:val="26"/>
                 <w:szCs w:val="26"/>
               </w:rPr>
-              <w:t>0 failure; Coverage ~97% Statement / 100% Branch (service.impl)</w:t>
-            </w:r>
-            <w:bookmarkStart w:id="0" w:name="_GoBack"/>
-            <w:bookmarkEnd w:id="0"/>
+              <w:t>0 failure; Coverage ~97% Statement / 100% Branch (</w:t>
+            </w:r>
+            <w:proofErr w:type="spellStart"/>
+            <w:proofErr w:type="gramStart"/>
+            <w:r>
+              <w:rPr>
+                <w:rFonts w:ascii="Times New Roman" w:hAnsi="Times New Roman" w:cs="Times New Roman"/>
+                <w:sz w:val="26"/>
+                <w:szCs w:val="26"/>
+              </w:rPr>
+              <w:t>service.impl</w:t>
+            </w:r>
+            <w:proofErr w:type="spellEnd"/>
+            <w:proofErr w:type="gramEnd"/>
+            <w:r>
+              <w:rPr>
+                <w:rFonts w:ascii="Times New Roman" w:hAnsi="Times New Roman" w:cs="Times New Roman"/>
+                <w:sz w:val="26"/>
+                <w:szCs w:val="26"/>
+              </w:rPr>
+              <w:t>)</w:t>
+            </w:r>
           </w:p>
         </w:tc>
       </w:tr>
@@ -915,8 +1812,58 @@
         <w:rPr>
           <w:szCs w:val="26"/>
         </w:rPr>
-        <w:t>3. Danh sách Bug theo mức độ</w:t>
-      </w:r>
+        <w:t xml:space="preserve">3. Danh </w:t>
+      </w:r>
+      <w:proofErr w:type="spellStart"/>
+      <w:r>
+        <w:rPr>
+          <w:szCs w:val="26"/>
+        </w:rPr>
+        <w:t>sách</w:t>
+      </w:r>
+      <w:proofErr w:type="spellEnd"/>
+      <w:r>
+        <w:rPr>
+          <w:szCs w:val="26"/>
+        </w:rPr>
+        <w:t xml:space="preserve"> Bug </w:t>
+      </w:r>
+      <w:proofErr w:type="spellStart"/>
+      <w:r>
+        <w:rPr>
+          <w:szCs w:val="26"/>
+        </w:rPr>
+        <w:t>theo</w:t>
+      </w:r>
+      <w:proofErr w:type="spellEnd"/>
+      <w:r>
+        <w:rPr>
+          <w:szCs w:val="26"/>
+        </w:rPr>
+        <w:t xml:space="preserve"> </w:t>
+      </w:r>
+      <w:proofErr w:type="spellStart"/>
+      <w:r>
+        <w:rPr>
+          <w:szCs w:val="26"/>
+        </w:rPr>
+        <w:t>mức</w:t>
+      </w:r>
+      <w:proofErr w:type="spellEnd"/>
+      <w:r>
+        <w:rPr>
+          <w:szCs w:val="26"/>
+        </w:rPr>
+        <w:t xml:space="preserve"> </w:t>
+      </w:r>
+      <w:proofErr w:type="spellStart"/>
+      <w:r>
+        <w:rPr>
+          <w:szCs w:val="26"/>
+        </w:rPr>
+        <w:t>độ</w:t>
+      </w:r>
+      <w:proofErr w:type="spellEnd"/>
     </w:p>
     <w:tbl>
       <w:tblPr>
@@ -946,6 +1893,7 @@
                 <w:szCs w:val="26"/>
               </w:rPr>
             </w:pPr>
+            <w:proofErr w:type="spellStart"/>
             <w:r>
               <w:rPr>
                 <w:rFonts w:ascii="Times New Roman" w:hAnsi="Times New Roman" w:cs="Times New Roman"/>
@@ -954,8 +1902,29 @@
                 <w:szCs w:val="26"/>
               </w:rPr>
               <w:lastRenderedPageBreak/>
-              <w:t>Mức độ</w:t>
-            </w:r>
+              <w:t>Mức</w:t>
+            </w:r>
+            <w:proofErr w:type="spellEnd"/>
+            <w:r>
+              <w:rPr>
+                <w:rFonts w:ascii="Times New Roman" w:hAnsi="Times New Roman" w:cs="Times New Roman"/>
+                <w:b/>
+                <w:sz w:val="26"/>
+                <w:szCs w:val="26"/>
+              </w:rPr>
+              <w:t xml:space="preserve"> </w:t>
+            </w:r>
+            <w:proofErr w:type="spellStart"/>
+            <w:r>
+              <w:rPr>
+                <w:rFonts w:ascii="Times New Roman" w:hAnsi="Times New Roman" w:cs="Times New Roman"/>
+                <w:b/>
+                <w:sz w:val="26"/>
+                <w:szCs w:val="26"/>
+              </w:rPr>
+              <w:t>độ</w:t>
+            </w:r>
+            <w:proofErr w:type="spellEnd"/>
           </w:p>
         </w:tc>
         <w:tc>
@@ -973,6 +1942,7 @@
                 <w:szCs w:val="26"/>
               </w:rPr>
             </w:pPr>
+            <w:proofErr w:type="spellStart"/>
             <w:r>
               <w:rPr>
                 <w:rFonts w:ascii="Times New Roman" w:hAnsi="Times New Roman" w:cs="Times New Roman"/>
@@ -980,8 +1950,29 @@
                 <w:sz w:val="26"/>
                 <w:szCs w:val="26"/>
               </w:rPr>
-              <w:t>Số lượng</w:t>
-            </w:r>
+              <w:t>Số</w:t>
+            </w:r>
+            <w:proofErr w:type="spellEnd"/>
+            <w:r>
+              <w:rPr>
+                <w:rFonts w:ascii="Times New Roman" w:hAnsi="Times New Roman" w:cs="Times New Roman"/>
+                <w:b/>
+                <w:sz w:val="26"/>
+                <w:szCs w:val="26"/>
+              </w:rPr>
+              <w:t xml:space="preserve"> </w:t>
+            </w:r>
+            <w:proofErr w:type="spellStart"/>
+            <w:r>
+              <w:rPr>
+                <w:rFonts w:ascii="Times New Roman" w:hAnsi="Times New Roman" w:cs="Times New Roman"/>
+                <w:b/>
+                <w:sz w:val="26"/>
+                <w:szCs w:val="26"/>
+              </w:rPr>
+              <w:t>lượng</w:t>
+            </w:r>
+            <w:proofErr w:type="spellEnd"/>
           </w:p>
         </w:tc>
         <w:tc>
@@ -999,6 +1990,7 @@
                 <w:szCs w:val="26"/>
               </w:rPr>
             </w:pPr>
+            <w:proofErr w:type="spellStart"/>
             <w:r>
               <w:rPr>
                 <w:rFonts w:ascii="Times New Roman" w:hAnsi="Times New Roman" w:cs="Times New Roman"/>
@@ -1006,7 +1998,17 @@
                 <w:sz w:val="26"/>
                 <w:szCs w:val="26"/>
               </w:rPr>
-              <w:t>Đã Fix</w:t>
+              <w:t>Đã</w:t>
+            </w:r>
+            <w:proofErr w:type="spellEnd"/>
+            <w:r>
+              <w:rPr>
+                <w:rFonts w:ascii="Times New Roman" w:hAnsi="Times New Roman" w:cs="Times New Roman"/>
+                <w:b/>
+                <w:sz w:val="26"/>
+                <w:szCs w:val="26"/>
+              </w:rPr>
+              <w:t xml:space="preserve"> Fix</w:t>
             </w:r>
           </w:p>
         </w:tc>
@@ -1025,6 +2027,7 @@
                 <w:szCs w:val="26"/>
               </w:rPr>
             </w:pPr>
+            <w:proofErr w:type="spellStart"/>
             <w:r>
               <w:rPr>
                 <w:rFonts w:ascii="Times New Roman" w:hAnsi="Times New Roman" w:cs="Times New Roman"/>
@@ -1032,8 +2035,29 @@
                 <w:sz w:val="26"/>
                 <w:szCs w:val="26"/>
               </w:rPr>
-              <w:t>Còn tồn</w:t>
-            </w:r>
+              <w:t>Còn</w:t>
+            </w:r>
+            <w:proofErr w:type="spellEnd"/>
+            <w:r>
+              <w:rPr>
+                <w:rFonts w:ascii="Times New Roman" w:hAnsi="Times New Roman" w:cs="Times New Roman"/>
+                <w:b/>
+                <w:sz w:val="26"/>
+                <w:szCs w:val="26"/>
+              </w:rPr>
+              <w:t xml:space="preserve"> </w:t>
+            </w:r>
+            <w:proofErr w:type="spellStart"/>
+            <w:r>
+              <w:rPr>
+                <w:rFonts w:ascii="Times New Roman" w:hAnsi="Times New Roman" w:cs="Times New Roman"/>
+                <w:b/>
+                <w:sz w:val="26"/>
+                <w:szCs w:val="26"/>
+              </w:rPr>
+              <w:t>tồn</w:t>
+            </w:r>
+            <w:proofErr w:type="spellEnd"/>
           </w:p>
         </w:tc>
       </w:tr>
@@ -1151,8 +2175,18 @@
                 <w:sz w:val="26"/>
                 <w:szCs w:val="26"/>
               </w:rPr>
-              <w:t>Trung bình</w:t>
-            </w:r>
+              <w:t xml:space="preserve">Trung </w:t>
+            </w:r>
+            <w:proofErr w:type="spellStart"/>
+            <w:r>
+              <w:rPr>
+                <w:rFonts w:ascii="Times New Roman" w:hAnsi="Times New Roman" w:cs="Times New Roman"/>
+                <w:sz w:val="26"/>
+                <w:szCs w:val="26"/>
+              </w:rPr>
+              <w:t>bình</w:t>
+            </w:r>
+            <w:proofErr w:type="spellEnd"/>
           </w:p>
         </w:tc>
         <w:tc>
@@ -1238,6 +2272,7 @@
                 <w:szCs w:val="26"/>
               </w:rPr>
             </w:pPr>
+            <w:proofErr w:type="spellStart"/>
             <w:r>
               <w:rPr>
                 <w:rFonts w:ascii="Times New Roman" w:hAnsi="Times New Roman" w:cs="Times New Roman"/>
@@ -1246,6 +2281,7 @@
               </w:rPr>
               <w:t>Thấp</w:t>
             </w:r>
+            <w:proofErr w:type="spellEnd"/>
           </w:p>
         </w:tc>
         <w:tc>
@@ -1332,13 +2368,23 @@
                 <w:szCs w:val="26"/>
               </w:rPr>
             </w:pPr>
-            <w:r>
-              <w:rPr>
-                <w:rFonts w:ascii="Times New Roman" w:hAnsi="Times New Roman" w:cs="Times New Roman"/>
-                <w:sz w:val="26"/>
-                <w:szCs w:val="26"/>
-              </w:rPr>
-              <w:t xml:space="preserve">Tổng </w:t>
+            <w:proofErr w:type="spellStart"/>
+            <w:r>
+              <w:rPr>
+                <w:rFonts w:ascii="Times New Roman" w:hAnsi="Times New Roman" w:cs="Times New Roman"/>
+                <w:sz w:val="26"/>
+                <w:szCs w:val="26"/>
+              </w:rPr>
+              <w:t>Tổng</w:t>
+            </w:r>
+            <w:proofErr w:type="spellEnd"/>
+            <w:r>
+              <w:rPr>
+                <w:rFonts w:ascii="Times New Roman" w:hAnsi="Times New Roman" w:cs="Times New Roman"/>
+                <w:sz w:val="26"/>
+                <w:szCs w:val="26"/>
+              </w:rPr>
+              <w:t xml:space="preserve"> </w:t>
             </w:r>
           </w:p>
         </w:tc>
@@ -1433,7 +2479,35 @@
         <w:rPr>
           <w:szCs w:val="26"/>
         </w:rPr>
-        <w:t>4. Kết quả Unit Test</w:t>
+        <w:t xml:space="preserve">4. </w:t>
+      </w:r>
+      <w:proofErr w:type="spellStart"/>
+      <w:r>
+        <w:rPr>
+          <w:szCs w:val="26"/>
+        </w:rPr>
+        <w:t>Kết</w:t>
+      </w:r>
+      <w:proofErr w:type="spellEnd"/>
+      <w:r>
+        <w:rPr>
+          <w:szCs w:val="26"/>
+        </w:rPr>
+        <w:t xml:space="preserve"> </w:t>
+      </w:r>
+      <w:proofErr w:type="spellStart"/>
+      <w:r>
+        <w:rPr>
+          <w:szCs w:val="26"/>
+        </w:rPr>
+        <w:t>quả</w:t>
+      </w:r>
+      <w:proofErr w:type="spellEnd"/>
+      <w:r>
+        <w:rPr>
+          <w:szCs w:val="26"/>
+        </w:rPr>
+        <w:t xml:space="preserve"> Unit Test</w:t>
       </w:r>
     </w:p>
     <w:p>
@@ -1467,15 +2541,87 @@
           <w:sz w:val="26"/>
           <w:szCs w:val="26"/>
         </w:rPr>
-        <w:t>Code coverage (JaCoCo – service layer): Instructions 97%, Branches 100%.</w:t>
-      </w:r>
-      <w:r>
-        <w:rPr>
-          <w:rFonts w:ascii="Times New Roman" w:hAnsi="Times New Roman" w:cs="Times New Roman"/>
-          <w:sz w:val="26"/>
-          <w:szCs w:val="26"/>
-        </w:rPr>
-        <w:t>Kết quả: All Pass trên CI</w:t>
+        <w:t>Code coverage (</w:t>
+      </w:r>
+      <w:proofErr w:type="spellStart"/>
+      <w:r>
+        <w:rPr>
+          <w:rFonts w:ascii="Times New Roman" w:hAnsi="Times New Roman" w:cs="Times New Roman"/>
+          <w:sz w:val="26"/>
+          <w:szCs w:val="26"/>
+        </w:rPr>
+        <w:t>JaCoCo</w:t>
+      </w:r>
+      <w:proofErr w:type="spellEnd"/>
+      <w:r>
+        <w:rPr>
+          <w:rFonts w:ascii="Times New Roman" w:hAnsi="Times New Roman" w:cs="Times New Roman"/>
+          <w:sz w:val="26"/>
+          <w:szCs w:val="26"/>
+        </w:rPr>
+        <w:t xml:space="preserve"> – service layer): Instructions 97%, Branches 100</w:t>
+      </w:r>
+      <w:proofErr w:type="gramStart"/>
+      <w:r>
+        <w:rPr>
+          <w:rFonts w:ascii="Times New Roman" w:hAnsi="Times New Roman" w:cs="Times New Roman"/>
+          <w:sz w:val="26"/>
+          <w:szCs w:val="26"/>
+        </w:rPr>
+        <w:t>%.</w:t>
+      </w:r>
+      <w:r>
+        <w:rPr>
+          <w:rFonts w:ascii="Times New Roman" w:hAnsi="Times New Roman" w:cs="Times New Roman"/>
+          <w:sz w:val="26"/>
+          <w:szCs w:val="26"/>
+        </w:rPr>
+        <w:t>Kết</w:t>
+      </w:r>
+      <w:proofErr w:type="gramEnd"/>
+      <w:r>
+        <w:rPr>
+          <w:rFonts w:ascii="Times New Roman" w:hAnsi="Times New Roman" w:cs="Times New Roman"/>
+          <w:sz w:val="26"/>
+          <w:szCs w:val="26"/>
+        </w:rPr>
+        <w:t xml:space="preserve"> </w:t>
+      </w:r>
+      <w:proofErr w:type="spellStart"/>
+      <w:r>
+        <w:rPr>
+          <w:rFonts w:ascii="Times New Roman" w:hAnsi="Times New Roman" w:cs="Times New Roman"/>
+          <w:sz w:val="26"/>
+          <w:szCs w:val="26"/>
+        </w:rPr>
+        <w:t>quả</w:t>
+      </w:r>
+      <w:proofErr w:type="spellEnd"/>
+      <w:r>
+        <w:rPr>
+          <w:rFonts w:ascii="Times New Roman" w:hAnsi="Times New Roman" w:cs="Times New Roman"/>
+          <w:sz w:val="26"/>
+          <w:szCs w:val="26"/>
+        </w:rPr>
+        <w:t xml:space="preserve">: All Pass </w:t>
+      </w:r>
+      <w:proofErr w:type="spellStart"/>
+      <w:r>
+        <w:rPr>
+          <w:rFonts w:ascii="Times New Roman" w:hAnsi="Times New Roman" w:cs="Times New Roman"/>
+          <w:sz w:val="26"/>
+          <w:szCs w:val="26"/>
+        </w:rPr>
+        <w:t>trên</w:t>
+      </w:r>
+      <w:proofErr w:type="spellEnd"/>
+      <w:r>
+        <w:rPr>
+          <w:rFonts w:ascii="Times New Roman" w:hAnsi="Times New Roman" w:cs="Times New Roman"/>
+          <w:sz w:val="26"/>
+          <w:szCs w:val="26"/>
+        </w:rPr>
+        <w:t xml:space="preserve"> CI</w:t>
       </w:r>
     </w:p>
     <w:p>
@@ -1498,7 +2644,49 @@
         <w:rPr>
           <w:szCs w:val="26"/>
         </w:rPr>
-        <w:t>5. Kết quả CodeceptJS (E2E Automation)</w:t>
+        <w:t xml:space="preserve">5. </w:t>
+      </w:r>
+      <w:proofErr w:type="spellStart"/>
+      <w:r>
+        <w:rPr>
+          <w:szCs w:val="26"/>
+        </w:rPr>
+        <w:t>Kết</w:t>
+      </w:r>
+      <w:proofErr w:type="spellEnd"/>
+      <w:r>
+        <w:rPr>
+          <w:szCs w:val="26"/>
+        </w:rPr>
+        <w:t xml:space="preserve"> </w:t>
+      </w:r>
+      <w:proofErr w:type="spellStart"/>
+      <w:r>
+        <w:rPr>
+          <w:szCs w:val="26"/>
+        </w:rPr>
+        <w:t>quả</w:t>
+      </w:r>
+      <w:proofErr w:type="spellEnd"/>
+      <w:r>
+        <w:rPr>
+          <w:szCs w:val="26"/>
+        </w:rPr>
+        <w:t xml:space="preserve"> </w:t>
+      </w:r>
+      <w:proofErr w:type="spellStart"/>
+      <w:r>
+        <w:rPr>
+          <w:szCs w:val="26"/>
+        </w:rPr>
+        <w:t>CodeceptJS</w:t>
+      </w:r>
+      <w:proofErr w:type="spellEnd"/>
+      <w:r>
+        <w:rPr>
+          <w:szCs w:val="26"/>
+        </w:rPr>
+        <w:t xml:space="preserve"> (E2E Automation)</w:t>
       </w:r>
     </w:p>
     <w:p>
@@ -1509,13 +2697,109 @@
           <w:szCs w:val="26"/>
         </w:rPr>
       </w:pPr>
-      <w:r>
-        <w:rPr>
-          <w:rFonts w:ascii="Times New Roman" w:hAnsi="Times New Roman" w:cs="Times New Roman"/>
-          <w:sz w:val="26"/>
-          <w:szCs w:val="26"/>
-        </w:rPr>
-        <w:t>Kết quả chạy thật (04/09/2026): 2 passed, 3 failed.</w:t>
+      <w:proofErr w:type="spellStart"/>
+      <w:r>
+        <w:rPr>
+          <w:rFonts w:ascii="Times New Roman" w:hAnsi="Times New Roman" w:cs="Times New Roman"/>
+          <w:sz w:val="26"/>
+          <w:szCs w:val="26"/>
+        </w:rPr>
+        <w:t>Kết</w:t>
+      </w:r>
+      <w:proofErr w:type="spellEnd"/>
+      <w:r>
+        <w:rPr>
+          <w:rFonts w:ascii="Times New Roman" w:hAnsi="Times New Roman" w:cs="Times New Roman"/>
+          <w:sz w:val="26"/>
+          <w:szCs w:val="26"/>
+        </w:rPr>
+        <w:t xml:space="preserve"> </w:t>
+      </w:r>
+      <w:proofErr w:type="spellStart"/>
+      <w:r>
+        <w:rPr>
+          <w:rFonts w:ascii="Times New Roman" w:hAnsi="Times New Roman" w:cs="Times New Roman"/>
+          <w:sz w:val="26"/>
+          <w:szCs w:val="26"/>
+        </w:rPr>
+        <w:t>quả</w:t>
+      </w:r>
+      <w:proofErr w:type="spellEnd"/>
+      <w:r>
+        <w:rPr>
+          <w:rFonts w:ascii="Times New Roman" w:hAnsi="Times New Roman" w:cs="Times New Roman"/>
+          <w:sz w:val="26"/>
+          <w:szCs w:val="26"/>
+        </w:rPr>
+        <w:t xml:space="preserve"> </w:t>
+      </w:r>
+      <w:proofErr w:type="spellStart"/>
+      <w:r>
+        <w:rPr>
+          <w:rFonts w:ascii="Times New Roman" w:hAnsi="Times New Roman" w:cs="Times New Roman"/>
+          <w:sz w:val="26"/>
+          <w:szCs w:val="26"/>
+        </w:rPr>
+        <w:t>chạy</w:t>
+      </w:r>
+      <w:proofErr w:type="spellEnd"/>
+      <w:r>
+        <w:rPr>
+          <w:rFonts w:ascii="Times New Roman" w:hAnsi="Times New Roman" w:cs="Times New Roman"/>
+          <w:sz w:val="26"/>
+          <w:szCs w:val="26"/>
+        </w:rPr>
+        <w:t xml:space="preserve"> </w:t>
+      </w:r>
+      <w:proofErr w:type="spellStart"/>
+      <w:r>
+        <w:rPr>
+          <w:rFonts w:ascii="Times New Roman" w:hAnsi="Times New Roman" w:cs="Times New Roman"/>
+          <w:sz w:val="26"/>
+          <w:szCs w:val="26"/>
+        </w:rPr>
+        <w:t>thật</w:t>
+      </w:r>
+      <w:proofErr w:type="spellEnd"/>
+      <w:r>
+        <w:rPr>
+          <w:rFonts w:ascii="Times New Roman" w:hAnsi="Times New Roman" w:cs="Times New Roman"/>
+          <w:sz w:val="26"/>
+          <w:szCs w:val="26"/>
+        </w:rPr>
+        <w:t xml:space="preserve"> (</w:t>
+      </w:r>
+      <w:r>
+        <w:rPr>
+          <w:rFonts w:ascii="Times New Roman" w:hAnsi="Times New Roman" w:cs="Times New Roman"/>
+          <w:sz w:val="26"/>
+          <w:szCs w:val="26"/>
+        </w:rPr>
+        <w:t>13</w:t>
+      </w:r>
+      <w:r>
+        <w:rPr>
+          <w:rFonts w:ascii="Times New Roman" w:hAnsi="Times New Roman" w:cs="Times New Roman"/>
+          <w:sz w:val="26"/>
+          <w:szCs w:val="26"/>
+        </w:rPr>
+        <w:t xml:space="preserve">/09/2026): </w:t>
+      </w:r>
+      <w:r>
+        <w:rPr>
+          <w:rFonts w:ascii="Times New Roman" w:hAnsi="Times New Roman" w:cs="Times New Roman"/>
+          <w:sz w:val="26"/>
+          <w:szCs w:val="26"/>
+        </w:rPr>
+        <w:t>All</w:t>
+      </w:r>
+      <w:r>
+        <w:rPr>
+          <w:rFonts w:ascii="Times New Roman" w:hAnsi="Times New Roman" w:cs="Times New Roman"/>
+          <w:sz w:val="26"/>
+          <w:szCs w:val="26"/>
+        </w:rPr>
+        <w:t xml:space="preserve"> failed.</w:t>
       </w:r>
     </w:p>
     <w:p>
@@ -1532,7 +2816,151 @@
           <w:sz w:val="26"/>
           <w:szCs w:val="26"/>
         </w:rPr>
-        <w:t>TC_FE_MGR_03: FAIL đúng kỳ vọng (SCRUM-44 – giá âm vẫn được lưu).</w:t>
+        <w:t xml:space="preserve">TC_FE_MGR_03: FAIL </w:t>
+      </w:r>
+      <w:proofErr w:type="spellStart"/>
+      <w:r>
+        <w:rPr>
+          <w:rFonts w:ascii="Times New Roman" w:hAnsi="Times New Roman" w:cs="Times New Roman"/>
+          <w:sz w:val="26"/>
+          <w:szCs w:val="26"/>
+        </w:rPr>
+        <w:t>đúng</w:t>
+      </w:r>
+      <w:proofErr w:type="spellEnd"/>
+      <w:r>
+        <w:rPr>
+          <w:rFonts w:ascii="Times New Roman" w:hAnsi="Times New Roman" w:cs="Times New Roman"/>
+          <w:sz w:val="26"/>
+          <w:szCs w:val="26"/>
+        </w:rPr>
+        <w:t xml:space="preserve"> </w:t>
+      </w:r>
+      <w:proofErr w:type="spellStart"/>
+      <w:r>
+        <w:rPr>
+          <w:rFonts w:ascii="Times New Roman" w:hAnsi="Times New Roman" w:cs="Times New Roman"/>
+          <w:sz w:val="26"/>
+          <w:szCs w:val="26"/>
+        </w:rPr>
+        <w:t>kỳ</w:t>
+      </w:r>
+      <w:proofErr w:type="spellEnd"/>
+      <w:r>
+        <w:rPr>
+          <w:rFonts w:ascii="Times New Roman" w:hAnsi="Times New Roman" w:cs="Times New Roman"/>
+          <w:sz w:val="26"/>
+          <w:szCs w:val="26"/>
+        </w:rPr>
+        <w:t xml:space="preserve"> </w:t>
+      </w:r>
+      <w:proofErr w:type="spellStart"/>
+      <w:r>
+        <w:rPr>
+          <w:rFonts w:ascii="Times New Roman" w:hAnsi="Times New Roman" w:cs="Times New Roman"/>
+          <w:sz w:val="26"/>
+          <w:szCs w:val="26"/>
+        </w:rPr>
+        <w:t>vọng</w:t>
+      </w:r>
+      <w:proofErr w:type="spellEnd"/>
+      <w:r>
+        <w:rPr>
+          <w:rFonts w:ascii="Times New Roman" w:hAnsi="Times New Roman" w:cs="Times New Roman"/>
+          <w:sz w:val="26"/>
+          <w:szCs w:val="26"/>
+        </w:rPr>
+        <w:t xml:space="preserve"> (SCRUM-44 – </w:t>
+      </w:r>
+      <w:proofErr w:type="spellStart"/>
+      <w:r>
+        <w:rPr>
+          <w:rFonts w:ascii="Times New Roman" w:hAnsi="Times New Roman" w:cs="Times New Roman"/>
+          <w:sz w:val="26"/>
+          <w:szCs w:val="26"/>
+        </w:rPr>
+        <w:t>giá</w:t>
+      </w:r>
+      <w:proofErr w:type="spellEnd"/>
+      <w:r>
+        <w:rPr>
+          <w:rFonts w:ascii="Times New Roman" w:hAnsi="Times New Roman" w:cs="Times New Roman"/>
+          <w:sz w:val="26"/>
+          <w:szCs w:val="26"/>
+        </w:rPr>
+        <w:t xml:space="preserve"> </w:t>
+      </w:r>
+      <w:proofErr w:type="spellStart"/>
+      <w:r>
+        <w:rPr>
+          <w:rFonts w:ascii="Times New Roman" w:hAnsi="Times New Roman" w:cs="Times New Roman"/>
+          <w:sz w:val="26"/>
+          <w:szCs w:val="26"/>
+        </w:rPr>
+        <w:t>âm</w:t>
+      </w:r>
+      <w:proofErr w:type="spellEnd"/>
+      <w:r>
+        <w:rPr>
+          <w:rFonts w:ascii="Times New Roman" w:hAnsi="Times New Roman" w:cs="Times New Roman"/>
+          <w:sz w:val="26"/>
+          <w:szCs w:val="26"/>
+        </w:rPr>
+        <w:t xml:space="preserve"> </w:t>
+      </w:r>
+      <w:proofErr w:type="spellStart"/>
+      <w:r>
+        <w:rPr>
+          <w:rFonts w:ascii="Times New Roman" w:hAnsi="Times New Roman" w:cs="Times New Roman"/>
+          <w:sz w:val="26"/>
+          <w:szCs w:val="26"/>
+        </w:rPr>
+        <w:t>vẫn</w:t>
+      </w:r>
+      <w:proofErr w:type="spellEnd"/>
+      <w:r>
+        <w:rPr>
+          <w:rFonts w:ascii="Times New Roman" w:hAnsi="Times New Roman" w:cs="Times New Roman"/>
+          <w:sz w:val="26"/>
+          <w:szCs w:val="26"/>
+        </w:rPr>
+        <w:t xml:space="preserve"> </w:t>
+      </w:r>
+      <w:proofErr w:type="spellStart"/>
+      <w:r>
+        <w:rPr>
+          <w:rFonts w:ascii="Times New Roman" w:hAnsi="Times New Roman" w:cs="Times New Roman"/>
+          <w:sz w:val="26"/>
+          <w:szCs w:val="26"/>
+        </w:rPr>
+        <w:t>được</w:t>
+      </w:r>
+      <w:proofErr w:type="spellEnd"/>
+      <w:r>
+        <w:rPr>
+          <w:rFonts w:ascii="Times New Roman" w:hAnsi="Times New Roman" w:cs="Times New Roman"/>
+          <w:sz w:val="26"/>
+          <w:szCs w:val="26"/>
+        </w:rPr>
+        <w:t xml:space="preserve"> </w:t>
+      </w:r>
+      <w:proofErr w:type="spellStart"/>
+      <w:r>
+        <w:rPr>
+          <w:rFonts w:ascii="Times New Roman" w:hAnsi="Times New Roman" w:cs="Times New Roman"/>
+          <w:sz w:val="26"/>
+          <w:szCs w:val="26"/>
+        </w:rPr>
+        <w:t>lưu</w:t>
+      </w:r>
+      <w:proofErr w:type="spellEnd"/>
+      <w:r>
+        <w:rPr>
+          <w:rFonts w:ascii="Times New Roman" w:hAnsi="Times New Roman" w:cs="Times New Roman"/>
+          <w:sz w:val="26"/>
+          <w:szCs w:val="26"/>
+        </w:rPr>
+        <w:t>).</w:t>
       </w:r>
     </w:p>
     <w:p>
@@ -1549,7 +2977,115 @@
           <w:sz w:val="26"/>
           <w:szCs w:val="26"/>
         </w:rPr>
-        <w:t>TC_FE_CUS_CART_01, TC_FE_CUS_CHK_01: FAIL do assertion/expected của script, không phải bug sản phẩm mới.</w:t>
+        <w:t xml:space="preserve">TC_FE_CUS_CART_01, TC_FE_CUS_CHK_01: FAIL do assertion/expected </w:t>
+      </w:r>
+      <w:proofErr w:type="spellStart"/>
+      <w:r>
+        <w:rPr>
+          <w:rFonts w:ascii="Times New Roman" w:hAnsi="Times New Roman" w:cs="Times New Roman"/>
+          <w:sz w:val="26"/>
+          <w:szCs w:val="26"/>
+        </w:rPr>
+        <w:t>của</w:t>
+      </w:r>
+      <w:proofErr w:type="spellEnd"/>
+      <w:r>
+        <w:rPr>
+          <w:rFonts w:ascii="Times New Roman" w:hAnsi="Times New Roman" w:cs="Times New Roman"/>
+          <w:sz w:val="26"/>
+          <w:szCs w:val="26"/>
+        </w:rPr>
+        <w:t xml:space="preserve"> script, </w:t>
+      </w:r>
+      <w:proofErr w:type="spellStart"/>
+      <w:r>
+        <w:rPr>
+          <w:rFonts w:ascii="Times New Roman" w:hAnsi="Times New Roman" w:cs="Times New Roman"/>
+          <w:sz w:val="26"/>
+          <w:szCs w:val="26"/>
+        </w:rPr>
+        <w:t>không</w:t>
+      </w:r>
+      <w:proofErr w:type="spellEnd"/>
+      <w:r>
+        <w:rPr>
+          <w:rFonts w:ascii="Times New Roman" w:hAnsi="Times New Roman" w:cs="Times New Roman"/>
+          <w:sz w:val="26"/>
+          <w:szCs w:val="26"/>
+        </w:rPr>
+        <w:t xml:space="preserve"> </w:t>
+      </w:r>
+      <w:proofErr w:type="spellStart"/>
+      <w:r>
+        <w:rPr>
+          <w:rFonts w:ascii="Times New Roman" w:hAnsi="Times New Roman" w:cs="Times New Roman"/>
+          <w:sz w:val="26"/>
+          <w:szCs w:val="26"/>
+        </w:rPr>
+        <w:t>phải</w:t>
+      </w:r>
+      <w:proofErr w:type="spellEnd"/>
+      <w:r>
+        <w:rPr>
+          <w:rFonts w:ascii="Times New Roman" w:hAnsi="Times New Roman" w:cs="Times New Roman"/>
+          <w:sz w:val="26"/>
+          <w:szCs w:val="26"/>
+        </w:rPr>
+        <w:t xml:space="preserve"> bug </w:t>
+      </w:r>
+      <w:proofErr w:type="spellStart"/>
+      <w:r>
+        <w:rPr>
+          <w:rFonts w:ascii="Times New Roman" w:hAnsi="Times New Roman" w:cs="Times New Roman"/>
+          <w:sz w:val="26"/>
+          <w:szCs w:val="26"/>
+        </w:rPr>
+        <w:t>sản</w:t>
+      </w:r>
+      <w:proofErr w:type="spellEnd"/>
+      <w:r>
+        <w:rPr>
+          <w:rFonts w:ascii="Times New Roman" w:hAnsi="Times New Roman" w:cs="Times New Roman"/>
+          <w:sz w:val="26"/>
+          <w:szCs w:val="26"/>
+        </w:rPr>
+        <w:t xml:space="preserve"> </w:t>
+      </w:r>
+      <w:proofErr w:type="spellStart"/>
+      <w:r>
+        <w:rPr>
+          <w:rFonts w:ascii="Times New Roman" w:hAnsi="Times New Roman" w:cs="Times New Roman"/>
+          <w:sz w:val="26"/>
+          <w:szCs w:val="26"/>
+        </w:rPr>
+        <w:t>phẩm</w:t>
+      </w:r>
+      <w:proofErr w:type="spellEnd"/>
+      <w:r>
+        <w:rPr>
+          <w:rFonts w:ascii="Times New Roman" w:hAnsi="Times New Roman" w:cs="Times New Roman"/>
+          <w:sz w:val="26"/>
+          <w:szCs w:val="26"/>
+        </w:rPr>
+        <w:t xml:space="preserve"> </w:t>
+      </w:r>
+      <w:proofErr w:type="spellStart"/>
+      <w:r>
+        <w:rPr>
+          <w:rFonts w:ascii="Times New Roman" w:hAnsi="Times New Roman" w:cs="Times New Roman"/>
+          <w:sz w:val="26"/>
+          <w:szCs w:val="26"/>
+        </w:rPr>
+        <w:t>mới</w:t>
+      </w:r>
+      <w:proofErr w:type="spellEnd"/>
+      <w:r>
+        <w:rPr>
+          <w:rFonts w:ascii="Times New Roman" w:hAnsi="Times New Roman" w:cs="Times New Roman"/>
+          <w:sz w:val="26"/>
+          <w:szCs w:val="26"/>
+        </w:rPr>
+        <w:t>.</w:t>
       </w:r>
     </w:p>
     <w:p>
@@ -1572,7 +3108,63 @@
         <w:rPr>
           <w:szCs w:val="26"/>
         </w:rPr>
-        <w:t>6. Điểm nhấn đáng chú ý (Highlight)</w:t>
+        <w:t xml:space="preserve">6. </w:t>
+      </w:r>
+      <w:proofErr w:type="spellStart"/>
+      <w:r>
+        <w:rPr>
+          <w:szCs w:val="26"/>
+        </w:rPr>
+        <w:t>Điểm</w:t>
+      </w:r>
+      <w:proofErr w:type="spellEnd"/>
+      <w:r>
+        <w:rPr>
+          <w:szCs w:val="26"/>
+        </w:rPr>
+        <w:t xml:space="preserve"> </w:t>
+      </w:r>
+      <w:proofErr w:type="spellStart"/>
+      <w:r>
+        <w:rPr>
+          <w:szCs w:val="26"/>
+        </w:rPr>
+        <w:t>nhấn</w:t>
+      </w:r>
+      <w:proofErr w:type="spellEnd"/>
+      <w:r>
+        <w:rPr>
+          <w:szCs w:val="26"/>
+        </w:rPr>
+        <w:t xml:space="preserve"> </w:t>
+      </w:r>
+      <w:proofErr w:type="spellStart"/>
+      <w:r>
+        <w:rPr>
+          <w:szCs w:val="26"/>
+        </w:rPr>
+        <w:t>đáng</w:t>
+      </w:r>
+      <w:proofErr w:type="spellEnd"/>
+      <w:r>
+        <w:rPr>
+          <w:szCs w:val="26"/>
+        </w:rPr>
+        <w:t xml:space="preserve"> </w:t>
+      </w:r>
+      <w:proofErr w:type="spellStart"/>
+      <w:r>
+        <w:rPr>
+          <w:szCs w:val="26"/>
+        </w:rPr>
+        <w:t>chú</w:t>
+      </w:r>
+      <w:proofErr w:type="spellEnd"/>
+      <w:r>
+        <w:rPr>
+          <w:szCs w:val="26"/>
+        </w:rPr>
+        <w:t xml:space="preserve"> ý (Highlight)</w:t>
       </w:r>
     </w:p>
     <w:p>
@@ -1583,13 +3175,95 @@
           <w:szCs w:val="26"/>
         </w:rPr>
       </w:pPr>
-      <w:r>
-        <w:rPr>
-          <w:rFonts w:ascii="Times New Roman" w:hAnsi="Times New Roman" w:cs="Times New Roman"/>
-          <w:sz w:val="26"/>
-          <w:szCs w:val="26"/>
-        </w:rPr>
-        <w:t xml:space="preserve">Lỗ hổng privilege escalation (đăng ký role tùy ý) </w:t>
+      <w:proofErr w:type="spellStart"/>
+      <w:r>
+        <w:rPr>
+          <w:rFonts w:ascii="Times New Roman" w:hAnsi="Times New Roman" w:cs="Times New Roman"/>
+          <w:sz w:val="26"/>
+          <w:szCs w:val="26"/>
+        </w:rPr>
+        <w:t>Lỗ</w:t>
+      </w:r>
+      <w:proofErr w:type="spellEnd"/>
+      <w:r>
+        <w:rPr>
+          <w:rFonts w:ascii="Times New Roman" w:hAnsi="Times New Roman" w:cs="Times New Roman"/>
+          <w:sz w:val="26"/>
+          <w:szCs w:val="26"/>
+        </w:rPr>
+        <w:t xml:space="preserve"> </w:t>
+      </w:r>
+      <w:proofErr w:type="spellStart"/>
+      <w:r>
+        <w:rPr>
+          <w:rFonts w:ascii="Times New Roman" w:hAnsi="Times New Roman" w:cs="Times New Roman"/>
+          <w:sz w:val="26"/>
+          <w:szCs w:val="26"/>
+        </w:rPr>
+        <w:t>hổng</w:t>
+      </w:r>
+      <w:proofErr w:type="spellEnd"/>
+      <w:r>
+        <w:rPr>
+          <w:rFonts w:ascii="Times New Roman" w:hAnsi="Times New Roman" w:cs="Times New Roman"/>
+          <w:sz w:val="26"/>
+          <w:szCs w:val="26"/>
+        </w:rPr>
+        <w:t xml:space="preserve"> privilege escalation (</w:t>
+      </w:r>
+      <w:proofErr w:type="spellStart"/>
+      <w:r>
+        <w:rPr>
+          <w:rFonts w:ascii="Times New Roman" w:hAnsi="Times New Roman" w:cs="Times New Roman"/>
+          <w:sz w:val="26"/>
+          <w:szCs w:val="26"/>
+        </w:rPr>
+        <w:t>đăng</w:t>
+      </w:r>
+      <w:proofErr w:type="spellEnd"/>
+      <w:r>
+        <w:rPr>
+          <w:rFonts w:ascii="Times New Roman" w:hAnsi="Times New Roman" w:cs="Times New Roman"/>
+          <w:sz w:val="26"/>
+          <w:szCs w:val="26"/>
+        </w:rPr>
+        <w:t xml:space="preserve"> </w:t>
+      </w:r>
+      <w:proofErr w:type="spellStart"/>
+      <w:r>
+        <w:rPr>
+          <w:rFonts w:ascii="Times New Roman" w:hAnsi="Times New Roman" w:cs="Times New Roman"/>
+          <w:sz w:val="26"/>
+          <w:szCs w:val="26"/>
+        </w:rPr>
+        <w:t>ký</w:t>
+      </w:r>
+      <w:proofErr w:type="spellEnd"/>
+      <w:r>
+        <w:rPr>
+          <w:rFonts w:ascii="Times New Roman" w:hAnsi="Times New Roman" w:cs="Times New Roman"/>
+          <w:sz w:val="26"/>
+          <w:szCs w:val="26"/>
+        </w:rPr>
+        <w:t xml:space="preserve"> role </w:t>
+      </w:r>
+      <w:proofErr w:type="spellStart"/>
+      <w:r>
+        <w:rPr>
+          <w:rFonts w:ascii="Times New Roman" w:hAnsi="Times New Roman" w:cs="Times New Roman"/>
+          <w:sz w:val="26"/>
+          <w:szCs w:val="26"/>
+        </w:rPr>
+        <w:t>tùy</w:t>
+      </w:r>
+      <w:proofErr w:type="spellEnd"/>
+      <w:r>
+        <w:rPr>
+          <w:rFonts w:ascii="Times New Roman" w:hAnsi="Times New Roman" w:cs="Times New Roman"/>
+          <w:sz w:val="26"/>
+          <w:szCs w:val="26"/>
+        </w:rPr>
+        <w:t xml:space="preserve"> ý) </w:t>
       </w:r>
     </w:p>
     <w:p>
@@ -1606,7 +3280,61 @@
           <w:sz w:val="26"/>
           <w:szCs w:val="26"/>
         </w:rPr>
-        <w:t xml:space="preserve">Pattern thiếu @Valid lặp lại (User + Cart) </w:t>
+        <w:t xml:space="preserve">Pattern </w:t>
+      </w:r>
+      <w:proofErr w:type="spellStart"/>
+      <w:r>
+        <w:rPr>
+          <w:rFonts w:ascii="Times New Roman" w:hAnsi="Times New Roman" w:cs="Times New Roman"/>
+          <w:sz w:val="26"/>
+          <w:szCs w:val="26"/>
+        </w:rPr>
+        <w:t>thiếu</w:t>
+      </w:r>
+      <w:proofErr w:type="spellEnd"/>
+      <w:r>
+        <w:rPr>
+          <w:rFonts w:ascii="Times New Roman" w:hAnsi="Times New Roman" w:cs="Times New Roman"/>
+          <w:sz w:val="26"/>
+          <w:szCs w:val="26"/>
+        </w:rPr>
+        <w:t xml:space="preserve"> @Valid </w:t>
+      </w:r>
+      <w:proofErr w:type="spellStart"/>
+      <w:r>
+        <w:rPr>
+          <w:rFonts w:ascii="Times New Roman" w:hAnsi="Times New Roman" w:cs="Times New Roman"/>
+          <w:sz w:val="26"/>
+          <w:szCs w:val="26"/>
+        </w:rPr>
+        <w:t>lặp</w:t>
+      </w:r>
+      <w:proofErr w:type="spellEnd"/>
+      <w:r>
+        <w:rPr>
+          <w:rFonts w:ascii="Times New Roman" w:hAnsi="Times New Roman" w:cs="Times New Roman"/>
+          <w:sz w:val="26"/>
+          <w:szCs w:val="26"/>
+        </w:rPr>
+        <w:t xml:space="preserve"> </w:t>
+      </w:r>
+      <w:proofErr w:type="spellStart"/>
+      <w:r>
+        <w:rPr>
+          <w:rFonts w:ascii="Times New Roman" w:hAnsi="Times New Roman" w:cs="Times New Roman"/>
+          <w:sz w:val="26"/>
+          <w:szCs w:val="26"/>
+        </w:rPr>
+        <w:t>lại</w:t>
+      </w:r>
+      <w:proofErr w:type="spellEnd"/>
+      <w:r>
+        <w:rPr>
+          <w:rFonts w:ascii="Times New Roman" w:hAnsi="Times New Roman" w:cs="Times New Roman"/>
+          <w:sz w:val="26"/>
+          <w:szCs w:val="26"/>
+        </w:rPr>
+        <w:t xml:space="preserve"> (User + Cart) </w:t>
       </w:r>
     </w:p>
     <w:p>
@@ -1623,8 +3351,126 @@
           <w:sz w:val="26"/>
           <w:szCs w:val="26"/>
         </w:rPr>
-        <w:t>Bug giá âm bắt được ở cả 3 tầng: Manual FE + API BVA + CodeceptJS</w:t>
-      </w:r>
+        <w:t xml:space="preserve">Bug </w:t>
+      </w:r>
+      <w:proofErr w:type="spellStart"/>
+      <w:r>
+        <w:rPr>
+          <w:rFonts w:ascii="Times New Roman" w:hAnsi="Times New Roman" w:cs="Times New Roman"/>
+          <w:sz w:val="26"/>
+          <w:szCs w:val="26"/>
+        </w:rPr>
+        <w:t>giá</w:t>
+      </w:r>
+      <w:proofErr w:type="spellEnd"/>
+      <w:r>
+        <w:rPr>
+          <w:rFonts w:ascii="Times New Roman" w:hAnsi="Times New Roman" w:cs="Times New Roman"/>
+          <w:sz w:val="26"/>
+          <w:szCs w:val="26"/>
+        </w:rPr>
+        <w:t xml:space="preserve"> </w:t>
+      </w:r>
+      <w:proofErr w:type="spellStart"/>
+      <w:r>
+        <w:rPr>
+          <w:rFonts w:ascii="Times New Roman" w:hAnsi="Times New Roman" w:cs="Times New Roman"/>
+          <w:sz w:val="26"/>
+          <w:szCs w:val="26"/>
+        </w:rPr>
+        <w:t>âm</w:t>
+      </w:r>
+      <w:proofErr w:type="spellEnd"/>
+      <w:r>
+        <w:rPr>
+          <w:rFonts w:ascii="Times New Roman" w:hAnsi="Times New Roman" w:cs="Times New Roman"/>
+          <w:sz w:val="26"/>
+          <w:szCs w:val="26"/>
+        </w:rPr>
+        <w:t xml:space="preserve"> </w:t>
+      </w:r>
+      <w:proofErr w:type="spellStart"/>
+      <w:r>
+        <w:rPr>
+          <w:rFonts w:ascii="Times New Roman" w:hAnsi="Times New Roman" w:cs="Times New Roman"/>
+          <w:sz w:val="26"/>
+          <w:szCs w:val="26"/>
+        </w:rPr>
+        <w:t>bắt</w:t>
+      </w:r>
+      <w:proofErr w:type="spellEnd"/>
+      <w:r>
+        <w:rPr>
+          <w:rFonts w:ascii="Times New Roman" w:hAnsi="Times New Roman" w:cs="Times New Roman"/>
+          <w:sz w:val="26"/>
+          <w:szCs w:val="26"/>
+        </w:rPr>
+        <w:t xml:space="preserve"> </w:t>
+      </w:r>
+      <w:proofErr w:type="spellStart"/>
+      <w:r>
+        <w:rPr>
+          <w:rFonts w:ascii="Times New Roman" w:hAnsi="Times New Roman" w:cs="Times New Roman"/>
+          <w:sz w:val="26"/>
+          <w:szCs w:val="26"/>
+        </w:rPr>
+        <w:t>được</w:t>
+      </w:r>
+      <w:proofErr w:type="spellEnd"/>
+      <w:r>
+        <w:rPr>
+          <w:rFonts w:ascii="Times New Roman" w:hAnsi="Times New Roman" w:cs="Times New Roman"/>
+          <w:sz w:val="26"/>
+          <w:szCs w:val="26"/>
+        </w:rPr>
+        <w:t xml:space="preserve"> ở </w:t>
+      </w:r>
+      <w:proofErr w:type="spellStart"/>
+      <w:r>
+        <w:rPr>
+          <w:rFonts w:ascii="Times New Roman" w:hAnsi="Times New Roman" w:cs="Times New Roman"/>
+          <w:sz w:val="26"/>
+          <w:szCs w:val="26"/>
+        </w:rPr>
+        <w:t>cả</w:t>
+      </w:r>
+      <w:proofErr w:type="spellEnd"/>
+      <w:r>
+        <w:rPr>
+          <w:rFonts w:ascii="Times New Roman" w:hAnsi="Times New Roman" w:cs="Times New Roman"/>
+          <w:sz w:val="26"/>
+          <w:szCs w:val="26"/>
+        </w:rPr>
+        <w:t xml:space="preserve"> 3 </w:t>
+      </w:r>
+      <w:proofErr w:type="spellStart"/>
+      <w:r>
+        <w:rPr>
+          <w:rFonts w:ascii="Times New Roman" w:hAnsi="Times New Roman" w:cs="Times New Roman"/>
+          <w:sz w:val="26"/>
+          <w:szCs w:val="26"/>
+        </w:rPr>
+        <w:t>tầng</w:t>
+      </w:r>
+      <w:proofErr w:type="spellEnd"/>
+      <w:r>
+        <w:rPr>
+          <w:rFonts w:ascii="Times New Roman" w:hAnsi="Times New Roman" w:cs="Times New Roman"/>
+          <w:sz w:val="26"/>
+          <w:szCs w:val="26"/>
+        </w:rPr>
+        <w:t xml:space="preserve">: Manual FE + API BVA + </w:t>
+      </w:r>
+      <w:proofErr w:type="spellStart"/>
+      <w:r>
+        <w:rPr>
+          <w:rFonts w:ascii="Times New Roman" w:hAnsi="Times New Roman" w:cs="Times New Roman"/>
+          <w:sz w:val="26"/>
+          <w:szCs w:val="26"/>
+        </w:rPr>
+        <w:t>CodeceptJS</w:t>
+      </w:r>
+      <w:proofErr w:type="spellEnd"/>
     </w:p>
     <w:p>
       <w:pPr>
@@ -1646,8 +3492,58 @@
         <w:rPr>
           <w:szCs w:val="26"/>
         </w:rPr>
-        <w:t>7. Kết luận &amp; Đề xuất</w:t>
-      </w:r>
+        <w:t xml:space="preserve">7. </w:t>
+      </w:r>
+      <w:proofErr w:type="spellStart"/>
+      <w:r>
+        <w:rPr>
+          <w:szCs w:val="26"/>
+        </w:rPr>
+        <w:t>Kết</w:t>
+      </w:r>
+      <w:proofErr w:type="spellEnd"/>
+      <w:r>
+        <w:rPr>
+          <w:szCs w:val="26"/>
+        </w:rPr>
+        <w:t xml:space="preserve"> </w:t>
+      </w:r>
+      <w:proofErr w:type="spellStart"/>
+      <w:r>
+        <w:rPr>
+          <w:szCs w:val="26"/>
+        </w:rPr>
+        <w:t>luận</w:t>
+      </w:r>
+      <w:proofErr w:type="spellEnd"/>
+      <w:r>
+        <w:rPr>
+          <w:szCs w:val="26"/>
+        </w:rPr>
+        <w:t xml:space="preserve"> &amp; </w:t>
+      </w:r>
+      <w:proofErr w:type="spellStart"/>
+      <w:r>
+        <w:rPr>
+          <w:szCs w:val="26"/>
+        </w:rPr>
+        <w:t>Đề</w:t>
+      </w:r>
+      <w:proofErr w:type="spellEnd"/>
+      <w:r>
+        <w:rPr>
+          <w:szCs w:val="26"/>
+        </w:rPr>
+        <w:t xml:space="preserve"> </w:t>
+      </w:r>
+      <w:proofErr w:type="spellStart"/>
+      <w:r>
+        <w:rPr>
+          <w:szCs w:val="26"/>
+        </w:rPr>
+        <w:t>xuất</w:t>
+      </w:r>
+      <w:proofErr w:type="spellEnd"/>
     </w:p>
     <w:p>
       <w:pPr>
@@ -1657,15 +3553,2044 @@
           <w:szCs w:val="26"/>
         </w:rPr>
       </w:pPr>
-      <w:r>
-        <w:rPr>
-          <w:rFonts w:ascii="Times New Roman" w:hAnsi="Times New Roman" w:cs="Times New Roman"/>
-          <w:sz w:val="26"/>
-          <w:szCs w:val="26"/>
-        </w:rPr>
-        <w:t>Sản phẩm chưa đủ điều kiện release vì còn lỗ hổng bảo mật (SCRUM-58) và validation quan trọng (giá âm, thiếu @Valid User/Cart, invalid order transition trả 500). Nếu có thêm thời gian: ưu tiên fix SCRUM-43/44/51/58 và bổ sung @Valid + GlobalExceptionHandler.</w:t>
+      <w:proofErr w:type="spellStart"/>
+      <w:r>
+        <w:rPr>
+          <w:rFonts w:ascii="Times New Roman" w:hAnsi="Times New Roman" w:cs="Times New Roman"/>
+          <w:sz w:val="26"/>
+          <w:szCs w:val="26"/>
+        </w:rPr>
+        <w:t>Đến</w:t>
+      </w:r>
+      <w:proofErr w:type="spellEnd"/>
+      <w:r>
+        <w:rPr>
+          <w:rFonts w:ascii="Times New Roman" w:hAnsi="Times New Roman" w:cs="Times New Roman"/>
+          <w:sz w:val="26"/>
+          <w:szCs w:val="26"/>
+        </w:rPr>
+        <w:t xml:space="preserve"> </w:t>
+      </w:r>
+      <w:proofErr w:type="spellStart"/>
+      <w:r>
+        <w:rPr>
+          <w:rFonts w:ascii="Times New Roman" w:hAnsi="Times New Roman" w:cs="Times New Roman"/>
+          <w:sz w:val="26"/>
+          <w:szCs w:val="26"/>
+        </w:rPr>
+        <w:t>hiện</w:t>
+      </w:r>
+      <w:proofErr w:type="spellEnd"/>
+      <w:r>
+        <w:rPr>
+          <w:rFonts w:ascii="Times New Roman" w:hAnsi="Times New Roman" w:cs="Times New Roman"/>
+          <w:sz w:val="26"/>
+          <w:szCs w:val="26"/>
+        </w:rPr>
+        <w:t xml:space="preserve"> </w:t>
+      </w:r>
+      <w:proofErr w:type="spellStart"/>
+      <w:r>
+        <w:rPr>
+          <w:rFonts w:ascii="Times New Roman" w:hAnsi="Times New Roman" w:cs="Times New Roman"/>
+          <w:sz w:val="26"/>
+          <w:szCs w:val="26"/>
+        </w:rPr>
+        <w:t>tại</w:t>
+      </w:r>
+      <w:proofErr w:type="spellEnd"/>
+      <w:r>
+        <w:rPr>
+          <w:rFonts w:ascii="Times New Roman" w:hAnsi="Times New Roman" w:cs="Times New Roman"/>
+          <w:sz w:val="26"/>
+          <w:szCs w:val="26"/>
+        </w:rPr>
+        <w:t xml:space="preserve">, </w:t>
+      </w:r>
+      <w:proofErr w:type="spellStart"/>
+      <w:r>
+        <w:rPr>
+          <w:rFonts w:ascii="Times New Roman" w:hAnsi="Times New Roman" w:cs="Times New Roman"/>
+          <w:sz w:val="26"/>
+          <w:szCs w:val="26"/>
+        </w:rPr>
+        <w:t>mặc</w:t>
+      </w:r>
+      <w:proofErr w:type="spellEnd"/>
+      <w:r>
+        <w:rPr>
+          <w:rFonts w:ascii="Times New Roman" w:hAnsi="Times New Roman" w:cs="Times New Roman"/>
+          <w:sz w:val="26"/>
+          <w:szCs w:val="26"/>
+        </w:rPr>
+        <w:t xml:space="preserve"> </w:t>
+      </w:r>
+      <w:proofErr w:type="spellStart"/>
+      <w:r>
+        <w:rPr>
+          <w:rFonts w:ascii="Times New Roman" w:hAnsi="Times New Roman" w:cs="Times New Roman"/>
+          <w:sz w:val="26"/>
+          <w:szCs w:val="26"/>
+        </w:rPr>
+        <w:t>dù</w:t>
+      </w:r>
+      <w:proofErr w:type="spellEnd"/>
+      <w:r>
+        <w:rPr>
+          <w:rFonts w:ascii="Times New Roman" w:hAnsi="Times New Roman" w:cs="Times New Roman"/>
+          <w:sz w:val="26"/>
+          <w:szCs w:val="26"/>
+        </w:rPr>
+        <w:t xml:space="preserve"> SCRUM 58 </w:t>
+      </w:r>
+      <w:proofErr w:type="spellStart"/>
+      <w:r>
+        <w:rPr>
+          <w:rFonts w:ascii="Times New Roman" w:hAnsi="Times New Roman" w:cs="Times New Roman"/>
+          <w:sz w:val="26"/>
+          <w:szCs w:val="26"/>
+        </w:rPr>
+        <w:t>và</w:t>
+      </w:r>
+      <w:proofErr w:type="spellEnd"/>
+      <w:r>
+        <w:rPr>
+          <w:rFonts w:ascii="Times New Roman" w:hAnsi="Times New Roman" w:cs="Times New Roman"/>
+          <w:sz w:val="26"/>
+          <w:szCs w:val="26"/>
+        </w:rPr>
+        <w:t xml:space="preserve"> </w:t>
+      </w:r>
+      <w:r>
+        <w:rPr>
+          <w:rFonts w:ascii="Times New Roman" w:hAnsi="Times New Roman" w:cs="Times New Roman"/>
+          <w:sz w:val="26"/>
+          <w:szCs w:val="26"/>
+        </w:rPr>
+        <w:t xml:space="preserve">validation </w:t>
+      </w:r>
+      <w:proofErr w:type="spellStart"/>
+      <w:r>
+        <w:rPr>
+          <w:rFonts w:ascii="Times New Roman" w:hAnsi="Times New Roman" w:cs="Times New Roman"/>
+          <w:sz w:val="26"/>
+          <w:szCs w:val="26"/>
+        </w:rPr>
+        <w:t>quan</w:t>
+      </w:r>
+      <w:proofErr w:type="spellEnd"/>
+      <w:r>
+        <w:rPr>
+          <w:rFonts w:ascii="Times New Roman" w:hAnsi="Times New Roman" w:cs="Times New Roman"/>
+          <w:sz w:val="26"/>
+          <w:szCs w:val="26"/>
+        </w:rPr>
+        <w:t xml:space="preserve"> </w:t>
+      </w:r>
+      <w:proofErr w:type="spellStart"/>
+      <w:r>
+        <w:rPr>
+          <w:rFonts w:ascii="Times New Roman" w:hAnsi="Times New Roman" w:cs="Times New Roman"/>
+          <w:sz w:val="26"/>
+          <w:szCs w:val="26"/>
+        </w:rPr>
+        <w:t>trọng</w:t>
+      </w:r>
+      <w:proofErr w:type="spellEnd"/>
+      <w:r>
+        <w:rPr>
+          <w:rFonts w:ascii="Times New Roman" w:hAnsi="Times New Roman" w:cs="Times New Roman"/>
+          <w:sz w:val="26"/>
+          <w:szCs w:val="26"/>
+        </w:rPr>
+        <w:t xml:space="preserve"> (</w:t>
+      </w:r>
+      <w:proofErr w:type="spellStart"/>
+      <w:r>
+        <w:rPr>
+          <w:rFonts w:ascii="Times New Roman" w:hAnsi="Times New Roman" w:cs="Times New Roman"/>
+          <w:sz w:val="26"/>
+          <w:szCs w:val="26"/>
+        </w:rPr>
+        <w:t>giá</w:t>
+      </w:r>
+      <w:proofErr w:type="spellEnd"/>
+      <w:r>
+        <w:rPr>
+          <w:rFonts w:ascii="Times New Roman" w:hAnsi="Times New Roman" w:cs="Times New Roman"/>
+          <w:sz w:val="26"/>
+          <w:szCs w:val="26"/>
+        </w:rPr>
+        <w:t xml:space="preserve"> </w:t>
+      </w:r>
+      <w:proofErr w:type="spellStart"/>
+      <w:r>
+        <w:rPr>
+          <w:rFonts w:ascii="Times New Roman" w:hAnsi="Times New Roman" w:cs="Times New Roman"/>
+          <w:sz w:val="26"/>
+          <w:szCs w:val="26"/>
+        </w:rPr>
+        <w:t>âm</w:t>
+      </w:r>
+      <w:proofErr w:type="spellEnd"/>
+      <w:r>
+        <w:rPr>
+          <w:rFonts w:ascii="Times New Roman" w:hAnsi="Times New Roman" w:cs="Times New Roman"/>
+          <w:sz w:val="26"/>
+          <w:szCs w:val="26"/>
+        </w:rPr>
+        <w:t xml:space="preserve">, </w:t>
+      </w:r>
+      <w:proofErr w:type="spellStart"/>
+      <w:r>
+        <w:rPr>
+          <w:rFonts w:ascii="Times New Roman" w:hAnsi="Times New Roman" w:cs="Times New Roman"/>
+          <w:sz w:val="26"/>
+          <w:szCs w:val="26"/>
+        </w:rPr>
+        <w:t>thiếu</w:t>
+      </w:r>
+      <w:proofErr w:type="spellEnd"/>
+      <w:r>
+        <w:rPr>
+          <w:rFonts w:ascii="Times New Roman" w:hAnsi="Times New Roman" w:cs="Times New Roman"/>
+          <w:sz w:val="26"/>
+          <w:szCs w:val="26"/>
+        </w:rPr>
+        <w:t xml:space="preserve"> @Valid User/Cart, invalid order transition </w:t>
+      </w:r>
+      <w:proofErr w:type="spellStart"/>
+      <w:r>
+        <w:rPr>
+          <w:rFonts w:ascii="Times New Roman" w:hAnsi="Times New Roman" w:cs="Times New Roman"/>
+          <w:sz w:val="26"/>
+          <w:szCs w:val="26"/>
+        </w:rPr>
+        <w:t>trả</w:t>
+      </w:r>
+      <w:proofErr w:type="spellEnd"/>
+      <w:r>
+        <w:rPr>
+          <w:rFonts w:ascii="Times New Roman" w:hAnsi="Times New Roman" w:cs="Times New Roman"/>
+          <w:sz w:val="26"/>
+          <w:szCs w:val="26"/>
+        </w:rPr>
+        <w:t xml:space="preserve"> 500</w:t>
+      </w:r>
+      <w:r>
+        <w:rPr>
+          <w:rFonts w:ascii="Times New Roman" w:hAnsi="Times New Roman" w:cs="Times New Roman"/>
+          <w:sz w:val="26"/>
+          <w:szCs w:val="26"/>
+        </w:rPr>
+        <w:t xml:space="preserve">) </w:t>
+      </w:r>
+      <w:proofErr w:type="spellStart"/>
+      <w:r>
+        <w:rPr>
+          <w:rFonts w:ascii="Times New Roman" w:hAnsi="Times New Roman" w:cs="Times New Roman"/>
+          <w:sz w:val="26"/>
+          <w:szCs w:val="26"/>
+        </w:rPr>
+        <w:t>đã</w:t>
+      </w:r>
+      <w:proofErr w:type="spellEnd"/>
+      <w:r>
+        <w:rPr>
+          <w:rFonts w:ascii="Times New Roman" w:hAnsi="Times New Roman" w:cs="Times New Roman"/>
+          <w:sz w:val="26"/>
+          <w:szCs w:val="26"/>
+        </w:rPr>
+        <w:t xml:space="preserve"> </w:t>
+      </w:r>
+      <w:proofErr w:type="spellStart"/>
+      <w:r>
+        <w:rPr>
+          <w:rFonts w:ascii="Times New Roman" w:hAnsi="Times New Roman" w:cs="Times New Roman"/>
+          <w:sz w:val="26"/>
+          <w:szCs w:val="26"/>
+        </w:rPr>
+        <w:t>hoàn</w:t>
+      </w:r>
+      <w:proofErr w:type="spellEnd"/>
+      <w:r>
+        <w:rPr>
+          <w:rFonts w:ascii="Times New Roman" w:hAnsi="Times New Roman" w:cs="Times New Roman"/>
+          <w:sz w:val="26"/>
+          <w:szCs w:val="26"/>
+        </w:rPr>
+        <w:t xml:space="preserve"> </w:t>
+      </w:r>
+      <w:proofErr w:type="spellStart"/>
+      <w:r>
+        <w:rPr>
+          <w:rFonts w:ascii="Times New Roman" w:hAnsi="Times New Roman" w:cs="Times New Roman"/>
+          <w:sz w:val="26"/>
+          <w:szCs w:val="26"/>
+        </w:rPr>
+        <w:t>tất</w:t>
+      </w:r>
+      <w:proofErr w:type="spellEnd"/>
+      <w:r>
+        <w:rPr>
+          <w:rFonts w:ascii="Times New Roman" w:hAnsi="Times New Roman" w:cs="Times New Roman"/>
+          <w:sz w:val="26"/>
+          <w:szCs w:val="26"/>
+        </w:rPr>
+        <w:t xml:space="preserve"> </w:t>
+      </w:r>
+      <w:proofErr w:type="spellStart"/>
+      <w:r>
+        <w:rPr>
+          <w:rFonts w:ascii="Times New Roman" w:hAnsi="Times New Roman" w:cs="Times New Roman"/>
+          <w:sz w:val="26"/>
+          <w:szCs w:val="26"/>
+        </w:rPr>
+        <w:t>chỉnh</w:t>
+      </w:r>
+      <w:proofErr w:type="spellEnd"/>
+      <w:r>
+        <w:rPr>
+          <w:rFonts w:ascii="Times New Roman" w:hAnsi="Times New Roman" w:cs="Times New Roman"/>
+          <w:sz w:val="26"/>
+          <w:szCs w:val="26"/>
+        </w:rPr>
+        <w:t xml:space="preserve"> </w:t>
+      </w:r>
+      <w:proofErr w:type="spellStart"/>
+      <w:r>
+        <w:rPr>
+          <w:rFonts w:ascii="Times New Roman" w:hAnsi="Times New Roman" w:cs="Times New Roman"/>
+          <w:sz w:val="26"/>
+          <w:szCs w:val="26"/>
+        </w:rPr>
+        <w:t>sửa</w:t>
+      </w:r>
+      <w:proofErr w:type="spellEnd"/>
+      <w:r>
+        <w:rPr>
+          <w:rFonts w:ascii="Times New Roman" w:hAnsi="Times New Roman" w:cs="Times New Roman"/>
+          <w:sz w:val="26"/>
+          <w:szCs w:val="26"/>
+        </w:rPr>
+        <w:t xml:space="preserve"> </w:t>
+      </w:r>
+      <w:proofErr w:type="spellStart"/>
+      <w:r>
+        <w:rPr>
+          <w:rFonts w:ascii="Times New Roman" w:hAnsi="Times New Roman" w:cs="Times New Roman"/>
+          <w:sz w:val="26"/>
+          <w:szCs w:val="26"/>
+        </w:rPr>
+        <w:t>nhưng</w:t>
+      </w:r>
+      <w:proofErr w:type="spellEnd"/>
+      <w:r>
+        <w:rPr>
+          <w:rFonts w:ascii="Times New Roman" w:hAnsi="Times New Roman" w:cs="Times New Roman"/>
+          <w:sz w:val="26"/>
+          <w:szCs w:val="26"/>
+        </w:rPr>
+        <w:t xml:space="preserve"> </w:t>
+      </w:r>
+      <w:proofErr w:type="spellStart"/>
+      <w:r>
+        <w:rPr>
+          <w:rFonts w:ascii="Times New Roman" w:hAnsi="Times New Roman" w:cs="Times New Roman"/>
+          <w:sz w:val="26"/>
+          <w:szCs w:val="26"/>
+        </w:rPr>
+        <w:t>sản</w:t>
+      </w:r>
+      <w:proofErr w:type="spellEnd"/>
+      <w:r>
+        <w:rPr>
+          <w:rFonts w:ascii="Times New Roman" w:hAnsi="Times New Roman" w:cs="Times New Roman"/>
+          <w:sz w:val="26"/>
+          <w:szCs w:val="26"/>
+        </w:rPr>
+        <w:t xml:space="preserve"> </w:t>
+      </w:r>
+      <w:proofErr w:type="spellStart"/>
+      <w:r>
+        <w:rPr>
+          <w:rFonts w:ascii="Times New Roman" w:hAnsi="Times New Roman" w:cs="Times New Roman"/>
+          <w:sz w:val="26"/>
+          <w:szCs w:val="26"/>
+        </w:rPr>
+        <w:t>phẩm</w:t>
+      </w:r>
+      <w:proofErr w:type="spellEnd"/>
+      <w:r>
+        <w:rPr>
+          <w:rFonts w:ascii="Times New Roman" w:hAnsi="Times New Roman" w:cs="Times New Roman"/>
+          <w:sz w:val="26"/>
+          <w:szCs w:val="26"/>
+        </w:rPr>
+        <w:t xml:space="preserve"> </w:t>
+      </w:r>
+      <w:proofErr w:type="spellStart"/>
+      <w:r>
+        <w:rPr>
+          <w:rFonts w:ascii="Times New Roman" w:hAnsi="Times New Roman" w:cs="Times New Roman"/>
+          <w:sz w:val="26"/>
+          <w:szCs w:val="26"/>
+        </w:rPr>
+        <w:t>vẫn</w:t>
+      </w:r>
+      <w:proofErr w:type="spellEnd"/>
+      <w:r>
+        <w:rPr>
+          <w:rFonts w:ascii="Times New Roman" w:hAnsi="Times New Roman" w:cs="Times New Roman"/>
+          <w:sz w:val="26"/>
+          <w:szCs w:val="26"/>
+        </w:rPr>
+        <w:t xml:space="preserve"> </w:t>
+      </w:r>
+      <w:proofErr w:type="spellStart"/>
+      <w:r>
+        <w:rPr>
+          <w:rFonts w:ascii="Times New Roman" w:hAnsi="Times New Roman" w:cs="Times New Roman"/>
+          <w:sz w:val="26"/>
+          <w:szCs w:val="26"/>
+        </w:rPr>
+        <w:t>vẫn</w:t>
+      </w:r>
+      <w:proofErr w:type="spellEnd"/>
+      <w:r>
+        <w:rPr>
+          <w:rFonts w:ascii="Times New Roman" w:hAnsi="Times New Roman" w:cs="Times New Roman"/>
+          <w:sz w:val="26"/>
+          <w:szCs w:val="26"/>
+        </w:rPr>
+        <w:t xml:space="preserve"> </w:t>
+      </w:r>
+      <w:proofErr w:type="spellStart"/>
+      <w:r>
+        <w:rPr>
+          <w:rFonts w:ascii="Times New Roman" w:hAnsi="Times New Roman" w:cs="Times New Roman"/>
+          <w:sz w:val="26"/>
+          <w:szCs w:val="26"/>
+        </w:rPr>
+        <w:t>chưa</w:t>
+      </w:r>
+      <w:proofErr w:type="spellEnd"/>
+      <w:r>
+        <w:rPr>
+          <w:rFonts w:ascii="Times New Roman" w:hAnsi="Times New Roman" w:cs="Times New Roman"/>
+          <w:sz w:val="26"/>
+          <w:szCs w:val="26"/>
+        </w:rPr>
+        <w:t xml:space="preserve"> </w:t>
+      </w:r>
+      <w:proofErr w:type="spellStart"/>
+      <w:r>
+        <w:rPr>
+          <w:rFonts w:ascii="Times New Roman" w:hAnsi="Times New Roman" w:cs="Times New Roman"/>
+          <w:sz w:val="26"/>
+          <w:szCs w:val="26"/>
+        </w:rPr>
+        <w:t>đủ</w:t>
+      </w:r>
+      <w:proofErr w:type="spellEnd"/>
+      <w:r>
+        <w:rPr>
+          <w:rFonts w:ascii="Times New Roman" w:hAnsi="Times New Roman" w:cs="Times New Roman"/>
+          <w:sz w:val="26"/>
+          <w:szCs w:val="26"/>
+        </w:rPr>
+        <w:t xml:space="preserve"> </w:t>
+      </w:r>
+      <w:proofErr w:type="spellStart"/>
+      <w:r>
+        <w:rPr>
+          <w:rFonts w:ascii="Times New Roman" w:hAnsi="Times New Roman" w:cs="Times New Roman"/>
+          <w:sz w:val="26"/>
+          <w:szCs w:val="26"/>
+        </w:rPr>
+        <w:t>điều</w:t>
+      </w:r>
+      <w:proofErr w:type="spellEnd"/>
+      <w:r>
+        <w:rPr>
+          <w:rFonts w:ascii="Times New Roman" w:hAnsi="Times New Roman" w:cs="Times New Roman"/>
+          <w:sz w:val="26"/>
+          <w:szCs w:val="26"/>
+        </w:rPr>
+        <w:t xml:space="preserve"> </w:t>
+      </w:r>
+      <w:proofErr w:type="spellStart"/>
+      <w:r>
+        <w:rPr>
+          <w:rFonts w:ascii="Times New Roman" w:hAnsi="Times New Roman" w:cs="Times New Roman"/>
+          <w:sz w:val="26"/>
+          <w:szCs w:val="26"/>
+        </w:rPr>
+        <w:t>kiện</w:t>
+      </w:r>
+      <w:proofErr w:type="spellEnd"/>
+      <w:r>
+        <w:rPr>
+          <w:rFonts w:ascii="Times New Roman" w:hAnsi="Times New Roman" w:cs="Times New Roman"/>
+          <w:sz w:val="26"/>
+          <w:szCs w:val="26"/>
+        </w:rPr>
+        <w:t xml:space="preserve"> release </w:t>
+      </w:r>
+      <w:proofErr w:type="spellStart"/>
+      <w:r>
+        <w:rPr>
+          <w:rFonts w:ascii="Times New Roman" w:hAnsi="Times New Roman" w:cs="Times New Roman"/>
+          <w:sz w:val="26"/>
+          <w:szCs w:val="26"/>
+        </w:rPr>
+        <w:t>chính</w:t>
+      </w:r>
+      <w:proofErr w:type="spellEnd"/>
+      <w:r>
+        <w:rPr>
+          <w:rFonts w:ascii="Times New Roman" w:hAnsi="Times New Roman" w:cs="Times New Roman"/>
+          <w:sz w:val="26"/>
+          <w:szCs w:val="26"/>
+        </w:rPr>
+        <w:t xml:space="preserve"> </w:t>
+      </w:r>
+      <w:proofErr w:type="spellStart"/>
+      <w:r>
+        <w:rPr>
+          <w:rFonts w:ascii="Times New Roman" w:hAnsi="Times New Roman" w:cs="Times New Roman"/>
+          <w:sz w:val="26"/>
+          <w:szCs w:val="26"/>
+        </w:rPr>
+        <w:t>thức</w:t>
+      </w:r>
+      <w:proofErr w:type="spellEnd"/>
+      <w:r>
+        <w:rPr>
+          <w:rFonts w:ascii="Times New Roman" w:hAnsi="Times New Roman" w:cs="Times New Roman"/>
+          <w:sz w:val="26"/>
+          <w:szCs w:val="26"/>
+        </w:rPr>
+        <w:t xml:space="preserve"> </w:t>
+      </w:r>
+      <w:proofErr w:type="spellStart"/>
+      <w:r>
+        <w:rPr>
+          <w:rFonts w:ascii="Times New Roman" w:hAnsi="Times New Roman" w:cs="Times New Roman"/>
+          <w:sz w:val="26"/>
+          <w:szCs w:val="26"/>
+        </w:rPr>
+        <w:t>vì</w:t>
+      </w:r>
+      <w:proofErr w:type="spellEnd"/>
+      <w:r>
+        <w:rPr>
+          <w:rFonts w:ascii="Times New Roman" w:hAnsi="Times New Roman" w:cs="Times New Roman"/>
+          <w:sz w:val="26"/>
+          <w:szCs w:val="26"/>
+        </w:rPr>
+        <w:t xml:space="preserve"> </w:t>
+      </w:r>
+      <w:proofErr w:type="spellStart"/>
+      <w:r>
+        <w:rPr>
+          <w:rFonts w:ascii="Times New Roman" w:hAnsi="Times New Roman" w:cs="Times New Roman"/>
+          <w:sz w:val="26"/>
+          <w:szCs w:val="26"/>
+        </w:rPr>
+        <w:t>vẫn</w:t>
+      </w:r>
+      <w:proofErr w:type="spellEnd"/>
+      <w:r>
+        <w:rPr>
+          <w:rFonts w:ascii="Times New Roman" w:hAnsi="Times New Roman" w:cs="Times New Roman"/>
+          <w:sz w:val="26"/>
+          <w:szCs w:val="26"/>
+        </w:rPr>
+        <w:t xml:space="preserve"> </w:t>
+      </w:r>
+      <w:proofErr w:type="spellStart"/>
+      <w:r>
+        <w:rPr>
+          <w:rFonts w:ascii="Times New Roman" w:hAnsi="Times New Roman" w:cs="Times New Roman"/>
+          <w:sz w:val="26"/>
+          <w:szCs w:val="26"/>
+        </w:rPr>
+        <w:t>còn</w:t>
+      </w:r>
+      <w:proofErr w:type="spellEnd"/>
+      <w:r>
+        <w:rPr>
+          <w:rFonts w:ascii="Times New Roman" w:hAnsi="Times New Roman" w:cs="Times New Roman"/>
+          <w:sz w:val="26"/>
+          <w:szCs w:val="26"/>
+        </w:rPr>
+        <w:t xml:space="preserve"> </w:t>
+      </w:r>
+      <w:r>
+        <w:rPr>
+          <w:rFonts w:ascii="Times New Roman" w:hAnsi="Times New Roman" w:cs="Times New Roman"/>
+          <w:sz w:val="26"/>
+          <w:szCs w:val="26"/>
+        </w:rPr>
+        <w:t>3</w:t>
+      </w:r>
+      <w:r>
+        <w:rPr>
+          <w:rFonts w:ascii="Times New Roman" w:hAnsi="Times New Roman" w:cs="Times New Roman"/>
+          <w:sz w:val="26"/>
+          <w:szCs w:val="26"/>
+        </w:rPr>
+        <w:t xml:space="preserve"> bug </w:t>
+      </w:r>
+      <w:proofErr w:type="spellStart"/>
+      <w:r>
+        <w:rPr>
+          <w:rFonts w:ascii="Times New Roman" w:hAnsi="Times New Roman" w:cs="Times New Roman"/>
+          <w:sz w:val="26"/>
+          <w:szCs w:val="26"/>
+        </w:rPr>
+        <w:t>nhỏ</w:t>
+      </w:r>
+      <w:proofErr w:type="spellEnd"/>
+      <w:r>
+        <w:rPr>
+          <w:rFonts w:ascii="Times New Roman" w:hAnsi="Times New Roman" w:cs="Times New Roman"/>
+          <w:sz w:val="26"/>
+          <w:szCs w:val="26"/>
+        </w:rPr>
+        <w:t xml:space="preserve"> ở Front</w:t>
+      </w:r>
+      <w:r>
+        <w:rPr>
+          <w:rFonts w:ascii="Times New Roman" w:hAnsi="Times New Roman" w:cs="Times New Roman"/>
+          <w:sz w:val="26"/>
+          <w:szCs w:val="26"/>
+        </w:rPr>
+        <w:t>e</w:t>
+      </w:r>
+      <w:r>
+        <w:rPr>
+          <w:rFonts w:ascii="Times New Roman" w:hAnsi="Times New Roman" w:cs="Times New Roman"/>
+          <w:sz w:val="26"/>
+          <w:szCs w:val="26"/>
+        </w:rPr>
+        <w:t xml:space="preserve">nd, </w:t>
+      </w:r>
+      <w:proofErr w:type="spellStart"/>
+      <w:r>
+        <w:rPr>
+          <w:rFonts w:ascii="Times New Roman" w:hAnsi="Times New Roman" w:cs="Times New Roman"/>
+          <w:sz w:val="26"/>
+          <w:szCs w:val="26"/>
+        </w:rPr>
+        <w:t>tuy</w:t>
+      </w:r>
+      <w:proofErr w:type="spellEnd"/>
+      <w:r>
+        <w:rPr>
+          <w:rFonts w:ascii="Times New Roman" w:hAnsi="Times New Roman" w:cs="Times New Roman"/>
+          <w:sz w:val="26"/>
+          <w:szCs w:val="26"/>
+        </w:rPr>
+        <w:t xml:space="preserve"> </w:t>
+      </w:r>
+      <w:proofErr w:type="spellStart"/>
+      <w:r>
+        <w:rPr>
+          <w:rFonts w:ascii="Times New Roman" w:hAnsi="Times New Roman" w:cs="Times New Roman"/>
+          <w:sz w:val="26"/>
+          <w:szCs w:val="26"/>
+        </w:rPr>
+        <w:t>nhiên</w:t>
+      </w:r>
+      <w:proofErr w:type="spellEnd"/>
+      <w:r>
+        <w:rPr>
+          <w:rFonts w:ascii="Times New Roman" w:hAnsi="Times New Roman" w:cs="Times New Roman"/>
+          <w:sz w:val="26"/>
+          <w:szCs w:val="26"/>
+        </w:rPr>
+        <w:t xml:space="preserve"> </w:t>
+      </w:r>
+      <w:proofErr w:type="spellStart"/>
+      <w:r>
+        <w:rPr>
+          <w:rFonts w:ascii="Times New Roman" w:hAnsi="Times New Roman" w:cs="Times New Roman"/>
+          <w:sz w:val="26"/>
+          <w:szCs w:val="26"/>
+        </w:rPr>
+        <w:t>đến</w:t>
+      </w:r>
+      <w:proofErr w:type="spellEnd"/>
+      <w:r>
+        <w:rPr>
+          <w:rFonts w:ascii="Times New Roman" w:hAnsi="Times New Roman" w:cs="Times New Roman"/>
+          <w:sz w:val="26"/>
+          <w:szCs w:val="26"/>
+        </w:rPr>
+        <w:t xml:space="preserve"> </w:t>
+      </w:r>
+      <w:proofErr w:type="spellStart"/>
+      <w:r>
+        <w:rPr>
+          <w:rFonts w:ascii="Times New Roman" w:hAnsi="Times New Roman" w:cs="Times New Roman"/>
+          <w:sz w:val="26"/>
+          <w:szCs w:val="26"/>
+        </w:rPr>
+        <w:t>hiện</w:t>
+      </w:r>
+      <w:proofErr w:type="spellEnd"/>
+      <w:r>
+        <w:rPr>
+          <w:rFonts w:ascii="Times New Roman" w:hAnsi="Times New Roman" w:cs="Times New Roman"/>
+          <w:sz w:val="26"/>
+          <w:szCs w:val="26"/>
+        </w:rPr>
+        <w:t xml:space="preserve"> </w:t>
+      </w:r>
+      <w:proofErr w:type="spellStart"/>
+      <w:r>
+        <w:rPr>
+          <w:rFonts w:ascii="Times New Roman" w:hAnsi="Times New Roman" w:cs="Times New Roman"/>
+          <w:sz w:val="26"/>
+          <w:szCs w:val="26"/>
+        </w:rPr>
+        <w:lastRenderedPageBreak/>
+        <w:t>tại</w:t>
+      </w:r>
+      <w:proofErr w:type="spellEnd"/>
+      <w:r>
+        <w:rPr>
+          <w:rFonts w:ascii="Times New Roman" w:hAnsi="Times New Roman" w:cs="Times New Roman"/>
+          <w:sz w:val="26"/>
+          <w:szCs w:val="26"/>
+        </w:rPr>
+        <w:t xml:space="preserve"> </w:t>
+      </w:r>
+      <w:proofErr w:type="spellStart"/>
+      <w:r>
+        <w:rPr>
+          <w:rFonts w:ascii="Times New Roman" w:hAnsi="Times New Roman" w:cs="Times New Roman"/>
+          <w:sz w:val="26"/>
+          <w:szCs w:val="26"/>
+        </w:rPr>
+        <w:t>đã</w:t>
+      </w:r>
+      <w:proofErr w:type="spellEnd"/>
+      <w:r>
+        <w:rPr>
+          <w:rFonts w:ascii="Times New Roman" w:hAnsi="Times New Roman" w:cs="Times New Roman"/>
+          <w:sz w:val="26"/>
+          <w:szCs w:val="26"/>
+        </w:rPr>
+        <w:t xml:space="preserve"> fix </w:t>
+      </w:r>
+      <w:proofErr w:type="spellStart"/>
+      <w:r>
+        <w:rPr>
+          <w:rFonts w:ascii="Times New Roman" w:hAnsi="Times New Roman" w:cs="Times New Roman"/>
+          <w:sz w:val="26"/>
+          <w:szCs w:val="26"/>
+        </w:rPr>
+        <w:t>hoàn</w:t>
+      </w:r>
+      <w:proofErr w:type="spellEnd"/>
+      <w:r>
+        <w:rPr>
+          <w:rFonts w:ascii="Times New Roman" w:hAnsi="Times New Roman" w:cs="Times New Roman"/>
+          <w:sz w:val="26"/>
+          <w:szCs w:val="26"/>
+        </w:rPr>
+        <w:t xml:space="preserve"> </w:t>
+      </w:r>
+      <w:proofErr w:type="spellStart"/>
+      <w:r>
+        <w:rPr>
+          <w:rFonts w:ascii="Times New Roman" w:hAnsi="Times New Roman" w:cs="Times New Roman"/>
+          <w:sz w:val="26"/>
+          <w:szCs w:val="26"/>
+        </w:rPr>
+        <w:t>tất</w:t>
+      </w:r>
+      <w:proofErr w:type="spellEnd"/>
+      <w:r>
+        <w:rPr>
+          <w:rFonts w:ascii="Times New Roman" w:hAnsi="Times New Roman" w:cs="Times New Roman"/>
+          <w:sz w:val="26"/>
+          <w:szCs w:val="26"/>
+        </w:rPr>
+        <w:t xml:space="preserve"> </w:t>
+      </w:r>
+      <w:proofErr w:type="spellStart"/>
+      <w:r>
+        <w:rPr>
+          <w:rFonts w:ascii="Times New Roman" w:hAnsi="Times New Roman" w:cs="Times New Roman"/>
+          <w:sz w:val="26"/>
+          <w:szCs w:val="26"/>
+        </w:rPr>
+        <w:t>các</w:t>
+      </w:r>
+      <w:proofErr w:type="spellEnd"/>
+      <w:r>
+        <w:rPr>
+          <w:rFonts w:ascii="Times New Roman" w:hAnsi="Times New Roman" w:cs="Times New Roman"/>
+          <w:sz w:val="26"/>
+          <w:szCs w:val="26"/>
+        </w:rPr>
+        <w:t xml:space="preserve"> SCRUM-43/44/51/58 </w:t>
+      </w:r>
+      <w:proofErr w:type="spellStart"/>
+      <w:r>
+        <w:rPr>
+          <w:rFonts w:ascii="Times New Roman" w:hAnsi="Times New Roman" w:cs="Times New Roman"/>
+          <w:sz w:val="26"/>
+          <w:szCs w:val="26"/>
+        </w:rPr>
+        <w:t>và</w:t>
+      </w:r>
+      <w:proofErr w:type="spellEnd"/>
+      <w:r>
+        <w:rPr>
+          <w:rFonts w:ascii="Times New Roman" w:hAnsi="Times New Roman" w:cs="Times New Roman"/>
+          <w:sz w:val="26"/>
+          <w:szCs w:val="26"/>
+        </w:rPr>
+        <w:t xml:space="preserve"> </w:t>
+      </w:r>
+      <w:proofErr w:type="spellStart"/>
+      <w:r>
+        <w:rPr>
+          <w:rFonts w:ascii="Times New Roman" w:hAnsi="Times New Roman" w:cs="Times New Roman"/>
+          <w:sz w:val="26"/>
+          <w:szCs w:val="26"/>
+        </w:rPr>
+        <w:t>cũng</w:t>
+      </w:r>
+      <w:proofErr w:type="spellEnd"/>
+      <w:r>
+        <w:rPr>
+          <w:rFonts w:ascii="Times New Roman" w:hAnsi="Times New Roman" w:cs="Times New Roman"/>
+          <w:sz w:val="26"/>
+          <w:szCs w:val="26"/>
+        </w:rPr>
+        <w:t xml:space="preserve"> </w:t>
+      </w:r>
+      <w:proofErr w:type="spellStart"/>
+      <w:r>
+        <w:rPr>
+          <w:rFonts w:ascii="Times New Roman" w:hAnsi="Times New Roman" w:cs="Times New Roman"/>
+          <w:sz w:val="26"/>
+          <w:szCs w:val="26"/>
+        </w:rPr>
+        <w:t>đã</w:t>
+      </w:r>
+      <w:proofErr w:type="spellEnd"/>
+      <w:r>
+        <w:rPr>
+          <w:rFonts w:ascii="Times New Roman" w:hAnsi="Times New Roman" w:cs="Times New Roman"/>
+          <w:sz w:val="26"/>
+          <w:szCs w:val="26"/>
+        </w:rPr>
+        <w:t xml:space="preserve"> </w:t>
+      </w:r>
+      <w:proofErr w:type="spellStart"/>
+      <w:r>
+        <w:rPr>
+          <w:rFonts w:ascii="Times New Roman" w:hAnsi="Times New Roman" w:cs="Times New Roman"/>
+          <w:sz w:val="26"/>
+          <w:szCs w:val="26"/>
+        </w:rPr>
+        <w:t>bổ</w:t>
+      </w:r>
+      <w:proofErr w:type="spellEnd"/>
+      <w:r>
+        <w:rPr>
+          <w:rFonts w:ascii="Times New Roman" w:hAnsi="Times New Roman" w:cs="Times New Roman"/>
+          <w:sz w:val="26"/>
+          <w:szCs w:val="26"/>
+        </w:rPr>
+        <w:t xml:space="preserve"> sung </w:t>
+      </w:r>
+      <w:proofErr w:type="spellStart"/>
+      <w:r>
+        <w:rPr>
+          <w:rFonts w:ascii="Times New Roman" w:hAnsi="Times New Roman" w:cs="Times New Roman"/>
+          <w:sz w:val="26"/>
+          <w:szCs w:val="26"/>
+        </w:rPr>
+        <w:t>hoàn</w:t>
+      </w:r>
+      <w:proofErr w:type="spellEnd"/>
+      <w:r>
+        <w:rPr>
+          <w:rFonts w:ascii="Times New Roman" w:hAnsi="Times New Roman" w:cs="Times New Roman"/>
+          <w:sz w:val="26"/>
+          <w:szCs w:val="26"/>
+        </w:rPr>
+        <w:t xml:space="preserve"> </w:t>
+      </w:r>
+      <w:proofErr w:type="spellStart"/>
+      <w:r>
+        <w:rPr>
+          <w:rFonts w:ascii="Times New Roman" w:hAnsi="Times New Roman" w:cs="Times New Roman"/>
+          <w:sz w:val="26"/>
+          <w:szCs w:val="26"/>
+        </w:rPr>
+        <w:t>tất</w:t>
+      </w:r>
+      <w:proofErr w:type="spellEnd"/>
+      <w:r>
+        <w:rPr>
+          <w:rFonts w:ascii="Times New Roman" w:hAnsi="Times New Roman" w:cs="Times New Roman"/>
+          <w:sz w:val="26"/>
+          <w:szCs w:val="26"/>
+        </w:rPr>
+        <w:t xml:space="preserve"> </w:t>
+      </w:r>
+      <w:r>
+        <w:rPr>
+          <w:rFonts w:ascii="Times New Roman" w:hAnsi="Times New Roman" w:cs="Times New Roman"/>
+          <w:sz w:val="26"/>
+          <w:szCs w:val="26"/>
+        </w:rPr>
+        <w:t xml:space="preserve">@Valid + </w:t>
+      </w:r>
+      <w:proofErr w:type="spellStart"/>
+      <w:r>
+        <w:rPr>
+          <w:rFonts w:ascii="Times New Roman" w:hAnsi="Times New Roman" w:cs="Times New Roman"/>
+          <w:sz w:val="26"/>
+          <w:szCs w:val="26"/>
+        </w:rPr>
+        <w:t>GlobalExceptionHandler</w:t>
+      </w:r>
+      <w:proofErr w:type="spellEnd"/>
+      <w:r>
+        <w:rPr>
+          <w:rFonts w:ascii="Times New Roman" w:hAnsi="Times New Roman" w:cs="Times New Roman"/>
+          <w:sz w:val="26"/>
+          <w:szCs w:val="26"/>
+        </w:rPr>
+        <w:t>.</w:t>
       </w:r>
     </w:p>
+    <w:p>
+      <w:pPr>
+        <w:rPr>
+          <w:rFonts w:ascii="Times New Roman" w:hAnsi="Times New Roman" w:cs="Times New Roman"/>
+          <w:sz w:val="26"/>
+          <w:szCs w:val="26"/>
+        </w:rPr>
+      </w:pPr>
+      <w:proofErr w:type="spellStart"/>
+      <w:r>
+        <w:rPr>
+          <w:rFonts w:ascii="Times New Roman" w:hAnsi="Times New Roman" w:cs="Times New Roman"/>
+          <w:sz w:val="26"/>
+          <w:szCs w:val="26"/>
+        </w:rPr>
+        <w:t>Kết</w:t>
+      </w:r>
+      <w:proofErr w:type="spellEnd"/>
+      <w:r>
+        <w:rPr>
+          <w:rFonts w:ascii="Times New Roman" w:hAnsi="Times New Roman" w:cs="Times New Roman"/>
+          <w:sz w:val="26"/>
+          <w:szCs w:val="26"/>
+        </w:rPr>
+        <w:t xml:space="preserve"> </w:t>
+      </w:r>
+      <w:proofErr w:type="spellStart"/>
+      <w:r>
+        <w:rPr>
+          <w:rFonts w:ascii="Times New Roman" w:hAnsi="Times New Roman" w:cs="Times New Roman"/>
+          <w:sz w:val="26"/>
+          <w:szCs w:val="26"/>
+        </w:rPr>
+        <w:t>quả</w:t>
+      </w:r>
+      <w:proofErr w:type="spellEnd"/>
+      <w:r>
+        <w:rPr>
+          <w:rFonts w:ascii="Times New Roman" w:hAnsi="Times New Roman" w:cs="Times New Roman"/>
+          <w:sz w:val="26"/>
+          <w:szCs w:val="26"/>
+        </w:rPr>
+        <w:t xml:space="preserve"> TEST </w:t>
+      </w:r>
+      <w:proofErr w:type="spellStart"/>
+      <w:r>
+        <w:rPr>
+          <w:rFonts w:ascii="Times New Roman" w:hAnsi="Times New Roman" w:cs="Times New Roman"/>
+          <w:sz w:val="26"/>
+          <w:szCs w:val="26"/>
+        </w:rPr>
+        <w:t>hiện</w:t>
+      </w:r>
+      <w:proofErr w:type="spellEnd"/>
+      <w:r>
+        <w:rPr>
+          <w:rFonts w:ascii="Times New Roman" w:hAnsi="Times New Roman" w:cs="Times New Roman"/>
+          <w:sz w:val="26"/>
+          <w:szCs w:val="26"/>
+        </w:rPr>
+        <w:t xml:space="preserve"> </w:t>
+      </w:r>
+      <w:proofErr w:type="spellStart"/>
+      <w:r>
+        <w:rPr>
+          <w:rFonts w:ascii="Times New Roman" w:hAnsi="Times New Roman" w:cs="Times New Roman"/>
+          <w:sz w:val="26"/>
+          <w:szCs w:val="26"/>
+        </w:rPr>
+        <w:t>tại</w:t>
+      </w:r>
+      <w:proofErr w:type="spellEnd"/>
+      <w:r>
+        <w:rPr>
+          <w:rFonts w:ascii="Times New Roman" w:hAnsi="Times New Roman" w:cs="Times New Roman"/>
+          <w:sz w:val="26"/>
+          <w:szCs w:val="26"/>
+        </w:rPr>
+        <w:t xml:space="preserve"> (13/09/2026)</w:t>
+      </w:r>
+    </w:p>
+    <w:tbl>
+      <w:tblPr>
+        <w:tblStyle w:val="TableGrid"/>
+        <w:tblW w:w="9350" w:type="dxa"/>
+        <w:tblLook w:val="04A0" w:firstRow="1" w:lastRow="0" w:firstColumn="1" w:lastColumn="0" w:noHBand="0" w:noVBand="1"/>
+      </w:tblPr>
+      <w:tblGrid>
+        <w:gridCol w:w="1790"/>
+        <w:gridCol w:w="1803"/>
+        <w:gridCol w:w="2545"/>
+        <w:gridCol w:w="3212"/>
+      </w:tblGrid>
+      <w:tr>
+        <w:tc>
+          <w:tcPr>
+            <w:tcW w:w="1790" w:type="dxa"/>
+            <w:vAlign w:val="center"/>
+          </w:tcPr>
+          <w:p>
+            <w:pPr>
+              <w:rPr>
+                <w:rFonts w:ascii="Times New Roman" w:hAnsi="Times New Roman" w:cs="Times New Roman"/>
+                <w:sz w:val="26"/>
+                <w:szCs w:val="26"/>
+              </w:rPr>
+            </w:pPr>
+            <w:proofErr w:type="spellStart"/>
+            <w:r>
+              <w:rPr>
+                <w:rFonts w:ascii="Times New Roman" w:hAnsi="Times New Roman" w:cs="Times New Roman"/>
+                <w:sz w:val="26"/>
+                <w:szCs w:val="26"/>
+              </w:rPr>
+              <w:t>Nhóm</w:t>
+            </w:r>
+            <w:proofErr w:type="spellEnd"/>
+          </w:p>
+        </w:tc>
+        <w:tc>
+          <w:tcPr>
+            <w:tcW w:w="1803" w:type="dxa"/>
+            <w:vAlign w:val="center"/>
+          </w:tcPr>
+          <w:p>
+            <w:pPr>
+              <w:rPr>
+                <w:rFonts w:ascii="Times New Roman" w:hAnsi="Times New Roman" w:cs="Times New Roman"/>
+                <w:sz w:val="26"/>
+                <w:szCs w:val="26"/>
+              </w:rPr>
+            </w:pPr>
+            <w:r>
+              <w:rPr>
+                <w:rFonts w:ascii="Times New Roman" w:hAnsi="Times New Roman" w:cs="Times New Roman"/>
+                <w:sz w:val="26"/>
+                <w:szCs w:val="26"/>
+              </w:rPr>
+              <w:t xml:space="preserve">Quy </w:t>
+            </w:r>
+            <w:proofErr w:type="spellStart"/>
+            <w:r>
+              <w:rPr>
+                <w:rFonts w:ascii="Times New Roman" w:hAnsi="Times New Roman" w:cs="Times New Roman"/>
+                <w:sz w:val="26"/>
+                <w:szCs w:val="26"/>
+              </w:rPr>
+              <w:t>mô</w:t>
+            </w:r>
+            <w:proofErr w:type="spellEnd"/>
+          </w:p>
+        </w:tc>
+        <w:tc>
+          <w:tcPr>
+            <w:tcW w:w="2545" w:type="dxa"/>
+            <w:vAlign w:val="center"/>
+          </w:tcPr>
+          <w:p>
+            <w:pPr>
+              <w:rPr>
+                <w:rFonts w:ascii="Times New Roman" w:hAnsi="Times New Roman" w:cs="Times New Roman"/>
+                <w:sz w:val="26"/>
+                <w:szCs w:val="26"/>
+              </w:rPr>
+            </w:pPr>
+            <w:r>
+              <w:rPr>
+                <w:rFonts w:ascii="Times New Roman" w:hAnsi="Times New Roman" w:cs="Times New Roman"/>
+                <w:sz w:val="26"/>
+                <w:szCs w:val="26"/>
+              </w:rPr>
+              <w:t>Pass / Fail (</w:t>
+            </w:r>
+            <w:proofErr w:type="spellStart"/>
+            <w:r>
+              <w:rPr>
+                <w:rFonts w:ascii="Times New Roman" w:hAnsi="Times New Roman" w:cs="Times New Roman"/>
+                <w:sz w:val="26"/>
+                <w:szCs w:val="26"/>
+              </w:rPr>
+              <w:t>tóm</w:t>
+            </w:r>
+            <w:proofErr w:type="spellEnd"/>
+            <w:r>
+              <w:rPr>
+                <w:rFonts w:ascii="Times New Roman" w:hAnsi="Times New Roman" w:cs="Times New Roman"/>
+                <w:sz w:val="26"/>
+                <w:szCs w:val="26"/>
+              </w:rPr>
+              <w:t xml:space="preserve"> </w:t>
+            </w:r>
+            <w:proofErr w:type="spellStart"/>
+            <w:r>
+              <w:rPr>
+                <w:rFonts w:ascii="Times New Roman" w:hAnsi="Times New Roman" w:cs="Times New Roman"/>
+                <w:sz w:val="26"/>
+                <w:szCs w:val="26"/>
+              </w:rPr>
+              <w:t>tắt</w:t>
+            </w:r>
+            <w:proofErr w:type="spellEnd"/>
+            <w:r>
+              <w:rPr>
+                <w:rFonts w:ascii="Times New Roman" w:hAnsi="Times New Roman" w:cs="Times New Roman"/>
+                <w:sz w:val="26"/>
+                <w:szCs w:val="26"/>
+              </w:rPr>
+              <w:t>)</w:t>
+            </w:r>
+          </w:p>
+        </w:tc>
+        <w:tc>
+          <w:tcPr>
+            <w:tcW w:w="3212" w:type="dxa"/>
+            <w:vAlign w:val="center"/>
+          </w:tcPr>
+          <w:p>
+            <w:pPr>
+              <w:rPr>
+                <w:rFonts w:ascii="Times New Roman" w:hAnsi="Times New Roman" w:cs="Times New Roman"/>
+                <w:sz w:val="26"/>
+                <w:szCs w:val="26"/>
+              </w:rPr>
+            </w:pPr>
+            <w:r>
+              <w:rPr>
+                <w:rFonts w:ascii="Times New Roman" w:hAnsi="Times New Roman" w:cs="Times New Roman"/>
+                <w:sz w:val="26"/>
+                <w:szCs w:val="26"/>
+              </w:rPr>
+              <w:t>TEST (RECHECK)</w:t>
+            </w:r>
+          </w:p>
+        </w:tc>
+      </w:tr>
+      <w:tr>
+        <w:tc>
+          <w:tcPr>
+            <w:tcW w:w="1790" w:type="dxa"/>
+            <w:vAlign w:val="center"/>
+          </w:tcPr>
+          <w:p>
+            <w:pPr>
+              <w:rPr>
+                <w:rFonts w:ascii="Times New Roman" w:hAnsi="Times New Roman" w:cs="Times New Roman"/>
+                <w:sz w:val="26"/>
+                <w:szCs w:val="26"/>
+              </w:rPr>
+            </w:pPr>
+            <w:r>
+              <w:rPr>
+                <w:rFonts w:ascii="Times New Roman" w:hAnsi="Times New Roman" w:cs="Times New Roman"/>
+                <w:sz w:val="26"/>
+                <w:szCs w:val="26"/>
+              </w:rPr>
+              <w:t>FE Manual</w:t>
+            </w:r>
+          </w:p>
+        </w:tc>
+        <w:tc>
+          <w:tcPr>
+            <w:tcW w:w="1803" w:type="dxa"/>
+            <w:vAlign w:val="center"/>
+          </w:tcPr>
+          <w:p>
+            <w:pPr>
+              <w:rPr>
+                <w:rFonts w:ascii="Times New Roman" w:hAnsi="Times New Roman" w:cs="Times New Roman"/>
+                <w:sz w:val="26"/>
+                <w:szCs w:val="26"/>
+              </w:rPr>
+            </w:pPr>
+            <w:r>
+              <w:rPr>
+                <w:rFonts w:ascii="Times New Roman" w:hAnsi="Times New Roman" w:cs="Times New Roman"/>
+                <w:sz w:val="26"/>
+                <w:szCs w:val="26"/>
+              </w:rPr>
+              <w:t>~43 TC</w:t>
+            </w:r>
+          </w:p>
+        </w:tc>
+        <w:tc>
+          <w:tcPr>
+            <w:tcW w:w="2545" w:type="dxa"/>
+            <w:vAlign w:val="center"/>
+          </w:tcPr>
+          <w:p>
+            <w:pPr>
+              <w:rPr>
+                <w:rFonts w:ascii="Times New Roman" w:hAnsi="Times New Roman" w:cs="Times New Roman"/>
+                <w:sz w:val="26"/>
+                <w:szCs w:val="26"/>
+              </w:rPr>
+            </w:pPr>
+            <w:r>
+              <w:rPr>
+                <w:rFonts w:ascii="Times New Roman" w:hAnsi="Times New Roman" w:cs="Times New Roman"/>
+                <w:sz w:val="26"/>
+                <w:szCs w:val="26"/>
+              </w:rPr>
+              <w:t xml:space="preserve">3 FAIL </w:t>
+            </w:r>
+            <w:proofErr w:type="spellStart"/>
+            <w:r>
+              <w:rPr>
+                <w:rFonts w:ascii="Times New Roman" w:hAnsi="Times New Roman" w:cs="Times New Roman"/>
+                <w:sz w:val="26"/>
+                <w:szCs w:val="26"/>
+              </w:rPr>
+              <w:t>chính</w:t>
+            </w:r>
+            <w:proofErr w:type="spellEnd"/>
+            <w:r>
+              <w:rPr>
+                <w:rFonts w:ascii="Times New Roman" w:hAnsi="Times New Roman" w:cs="Times New Roman"/>
+                <w:sz w:val="26"/>
+                <w:szCs w:val="26"/>
+              </w:rPr>
+              <w:t>: SCRUM-43, 44, 45 (+ typo 52)</w:t>
+            </w:r>
+          </w:p>
+        </w:tc>
+        <w:tc>
+          <w:tcPr>
+            <w:tcW w:w="3212" w:type="dxa"/>
+            <w:vAlign w:val="center"/>
+          </w:tcPr>
+          <w:p>
+            <w:pPr>
+              <w:rPr>
+                <w:rFonts w:ascii="Times New Roman" w:hAnsi="Times New Roman" w:cs="Times New Roman"/>
+                <w:sz w:val="26"/>
+                <w:szCs w:val="26"/>
+              </w:rPr>
+            </w:pPr>
+            <w:r>
+              <w:rPr>
+                <w:rFonts w:ascii="Times New Roman" w:hAnsi="Times New Roman" w:cs="Times New Roman"/>
+                <w:sz w:val="26"/>
+                <w:szCs w:val="26"/>
+              </w:rPr>
+              <w:t>PASSED</w:t>
+            </w:r>
+          </w:p>
+        </w:tc>
+      </w:tr>
+      <w:tr>
+        <w:tc>
+          <w:tcPr>
+            <w:tcW w:w="1790" w:type="dxa"/>
+            <w:vAlign w:val="center"/>
+          </w:tcPr>
+          <w:p>
+            <w:pPr>
+              <w:rPr>
+                <w:rFonts w:ascii="Times New Roman" w:hAnsi="Times New Roman" w:cs="Times New Roman"/>
+                <w:sz w:val="26"/>
+                <w:szCs w:val="26"/>
+              </w:rPr>
+            </w:pPr>
+            <w:r>
+              <w:rPr>
+                <w:rFonts w:ascii="Times New Roman" w:hAnsi="Times New Roman" w:cs="Times New Roman"/>
+                <w:sz w:val="26"/>
+                <w:szCs w:val="26"/>
+              </w:rPr>
+              <w:t>API functional</w:t>
+            </w:r>
+          </w:p>
+        </w:tc>
+        <w:tc>
+          <w:tcPr>
+            <w:tcW w:w="1803" w:type="dxa"/>
+            <w:vAlign w:val="center"/>
+          </w:tcPr>
+          <w:p>
+            <w:pPr>
+              <w:rPr>
+                <w:rFonts w:ascii="Times New Roman" w:hAnsi="Times New Roman" w:cs="Times New Roman"/>
+                <w:sz w:val="26"/>
+                <w:szCs w:val="26"/>
+              </w:rPr>
+            </w:pPr>
+            <w:r>
+              <w:rPr>
+                <w:rFonts w:ascii="Times New Roman" w:hAnsi="Times New Roman" w:cs="Times New Roman"/>
+                <w:sz w:val="26"/>
+                <w:szCs w:val="26"/>
+              </w:rPr>
+              <w:t>~40+ TC</w:t>
+            </w:r>
+          </w:p>
+        </w:tc>
+        <w:tc>
+          <w:tcPr>
+            <w:tcW w:w="2545" w:type="dxa"/>
+            <w:vAlign w:val="center"/>
+          </w:tcPr>
+          <w:p>
+            <w:pPr>
+              <w:rPr>
+                <w:rFonts w:ascii="Times New Roman" w:hAnsi="Times New Roman" w:cs="Times New Roman"/>
+                <w:sz w:val="26"/>
+                <w:szCs w:val="26"/>
+              </w:rPr>
+            </w:pPr>
+            <w:r>
+              <w:rPr>
+                <w:rFonts w:ascii="Times New Roman" w:hAnsi="Times New Roman" w:cs="Times New Roman"/>
+                <w:sz w:val="26"/>
+                <w:szCs w:val="26"/>
+              </w:rPr>
+              <w:t>FAIL: SCRUM-46, 58</w:t>
+            </w:r>
+          </w:p>
+        </w:tc>
+        <w:tc>
+          <w:tcPr>
+            <w:tcW w:w="3212" w:type="dxa"/>
+            <w:vAlign w:val="center"/>
+          </w:tcPr>
+          <w:p>
+            <w:pPr>
+              <w:rPr>
+                <w:rFonts w:ascii="Times New Roman" w:hAnsi="Times New Roman" w:cs="Times New Roman"/>
+                <w:sz w:val="26"/>
+                <w:szCs w:val="26"/>
+              </w:rPr>
+            </w:pPr>
+            <w:r>
+              <w:rPr>
+                <w:rFonts w:ascii="Times New Roman" w:hAnsi="Times New Roman" w:cs="Times New Roman"/>
+                <w:sz w:val="26"/>
+                <w:szCs w:val="26"/>
+              </w:rPr>
+              <w:t>PASSED</w:t>
+            </w:r>
+          </w:p>
+        </w:tc>
+      </w:tr>
+      <w:tr>
+        <w:tc>
+          <w:tcPr>
+            <w:tcW w:w="1790" w:type="dxa"/>
+            <w:vAlign w:val="center"/>
+          </w:tcPr>
+          <w:p>
+            <w:pPr>
+              <w:rPr>
+                <w:rFonts w:ascii="Times New Roman" w:hAnsi="Times New Roman" w:cs="Times New Roman"/>
+                <w:sz w:val="26"/>
+                <w:szCs w:val="26"/>
+              </w:rPr>
+            </w:pPr>
+            <w:r>
+              <w:rPr>
+                <w:rFonts w:ascii="Times New Roman" w:hAnsi="Times New Roman" w:cs="Times New Roman"/>
+                <w:sz w:val="26"/>
+                <w:szCs w:val="26"/>
+              </w:rPr>
+              <w:t>BVA Standard</w:t>
+            </w:r>
+          </w:p>
+        </w:tc>
+        <w:tc>
+          <w:tcPr>
+            <w:tcW w:w="1803" w:type="dxa"/>
+            <w:vAlign w:val="center"/>
+          </w:tcPr>
+          <w:p>
+            <w:pPr>
+              <w:rPr>
+                <w:rFonts w:ascii="Times New Roman" w:hAnsi="Times New Roman" w:cs="Times New Roman"/>
+                <w:sz w:val="26"/>
+                <w:szCs w:val="26"/>
+              </w:rPr>
+            </w:pPr>
+            <w:r>
+              <w:rPr>
+                <w:rFonts w:ascii="Times New Roman" w:hAnsi="Times New Roman" w:cs="Times New Roman"/>
+                <w:sz w:val="26"/>
+                <w:szCs w:val="26"/>
+              </w:rPr>
+              <w:t>51 TC</w:t>
+            </w:r>
+          </w:p>
+        </w:tc>
+        <w:tc>
+          <w:tcPr>
+            <w:tcW w:w="2545" w:type="dxa"/>
+            <w:vAlign w:val="center"/>
+          </w:tcPr>
+          <w:p>
+            <w:pPr>
+              <w:rPr>
+                <w:rFonts w:ascii="Times New Roman" w:hAnsi="Times New Roman" w:cs="Times New Roman"/>
+                <w:sz w:val="26"/>
+                <w:szCs w:val="26"/>
+              </w:rPr>
+            </w:pPr>
+            <w:proofErr w:type="spellStart"/>
+            <w:r>
+              <w:rPr>
+                <w:rFonts w:ascii="Times New Roman" w:hAnsi="Times New Roman" w:cs="Times New Roman"/>
+                <w:sz w:val="26"/>
+                <w:szCs w:val="26"/>
+              </w:rPr>
+              <w:t>Đa</w:t>
+            </w:r>
+            <w:proofErr w:type="spellEnd"/>
+            <w:r>
+              <w:rPr>
+                <w:rFonts w:ascii="Times New Roman" w:hAnsi="Times New Roman" w:cs="Times New Roman"/>
+                <w:sz w:val="26"/>
+                <w:szCs w:val="26"/>
+              </w:rPr>
+              <w:t xml:space="preserve"> </w:t>
+            </w:r>
+            <w:proofErr w:type="spellStart"/>
+            <w:r>
+              <w:rPr>
+                <w:rFonts w:ascii="Times New Roman" w:hAnsi="Times New Roman" w:cs="Times New Roman"/>
+                <w:sz w:val="26"/>
+                <w:szCs w:val="26"/>
+              </w:rPr>
+              <w:t>số</w:t>
+            </w:r>
+            <w:proofErr w:type="spellEnd"/>
+            <w:r>
+              <w:rPr>
+                <w:rFonts w:ascii="Times New Roman" w:hAnsi="Times New Roman" w:cs="Times New Roman"/>
+                <w:sz w:val="26"/>
+                <w:szCs w:val="26"/>
+              </w:rPr>
+              <w:t xml:space="preserve"> PASS; FAIL </w:t>
+            </w:r>
+            <w:proofErr w:type="spellStart"/>
+            <w:r>
+              <w:rPr>
+                <w:rFonts w:ascii="Times New Roman" w:hAnsi="Times New Roman" w:cs="Times New Roman"/>
+                <w:sz w:val="26"/>
+                <w:szCs w:val="26"/>
+              </w:rPr>
+              <w:t>chủ</w:t>
+            </w:r>
+            <w:proofErr w:type="spellEnd"/>
+            <w:r>
+              <w:rPr>
+                <w:rFonts w:ascii="Times New Roman" w:hAnsi="Times New Roman" w:cs="Times New Roman"/>
+                <w:sz w:val="26"/>
+                <w:szCs w:val="26"/>
+              </w:rPr>
+              <w:t xml:space="preserve"> </w:t>
+            </w:r>
+            <w:proofErr w:type="spellStart"/>
+            <w:r>
+              <w:rPr>
+                <w:rFonts w:ascii="Times New Roman" w:hAnsi="Times New Roman" w:cs="Times New Roman"/>
+                <w:sz w:val="26"/>
+                <w:szCs w:val="26"/>
+              </w:rPr>
+              <w:t>yếu</w:t>
+            </w:r>
+            <w:proofErr w:type="spellEnd"/>
+            <w:r>
+              <w:rPr>
+                <w:rFonts w:ascii="Times New Roman" w:hAnsi="Times New Roman" w:cs="Times New Roman"/>
+                <w:sz w:val="26"/>
+                <w:szCs w:val="26"/>
+              </w:rPr>
+              <w:t xml:space="preserve"> ở Robustness</w:t>
+            </w:r>
+          </w:p>
+        </w:tc>
+        <w:tc>
+          <w:tcPr>
+            <w:tcW w:w="3212" w:type="dxa"/>
+            <w:vAlign w:val="center"/>
+          </w:tcPr>
+          <w:p>
+            <w:pPr>
+              <w:rPr>
+                <w:rFonts w:ascii="Times New Roman" w:hAnsi="Times New Roman" w:cs="Times New Roman"/>
+                <w:sz w:val="26"/>
+                <w:szCs w:val="26"/>
+              </w:rPr>
+            </w:pPr>
+            <w:proofErr w:type="spellStart"/>
+            <w:r>
+              <w:rPr>
+                <w:rFonts w:ascii="Times New Roman" w:hAnsi="Times New Roman" w:cs="Times New Roman"/>
+                <w:sz w:val="26"/>
+                <w:szCs w:val="26"/>
+              </w:rPr>
+              <w:t>Đa</w:t>
+            </w:r>
+            <w:proofErr w:type="spellEnd"/>
+            <w:r>
+              <w:rPr>
+                <w:rFonts w:ascii="Times New Roman" w:hAnsi="Times New Roman" w:cs="Times New Roman"/>
+                <w:sz w:val="26"/>
+                <w:szCs w:val="26"/>
+              </w:rPr>
+              <w:t xml:space="preserve"> </w:t>
+            </w:r>
+            <w:proofErr w:type="spellStart"/>
+            <w:r>
+              <w:rPr>
+                <w:rFonts w:ascii="Times New Roman" w:hAnsi="Times New Roman" w:cs="Times New Roman"/>
+                <w:sz w:val="26"/>
+                <w:szCs w:val="26"/>
+              </w:rPr>
+              <w:t>số</w:t>
+            </w:r>
+            <w:proofErr w:type="spellEnd"/>
+            <w:r>
+              <w:rPr>
+                <w:rFonts w:ascii="Times New Roman" w:hAnsi="Times New Roman" w:cs="Times New Roman"/>
+                <w:sz w:val="26"/>
+                <w:szCs w:val="26"/>
+              </w:rPr>
+              <w:t xml:space="preserve"> PASS; FAIL </w:t>
+            </w:r>
+            <w:proofErr w:type="spellStart"/>
+            <w:r>
+              <w:rPr>
+                <w:rFonts w:ascii="Times New Roman" w:hAnsi="Times New Roman" w:cs="Times New Roman"/>
+                <w:sz w:val="26"/>
+                <w:szCs w:val="26"/>
+              </w:rPr>
+              <w:t>chủ</w:t>
+            </w:r>
+            <w:proofErr w:type="spellEnd"/>
+            <w:r>
+              <w:rPr>
+                <w:rFonts w:ascii="Times New Roman" w:hAnsi="Times New Roman" w:cs="Times New Roman"/>
+                <w:sz w:val="26"/>
+                <w:szCs w:val="26"/>
+              </w:rPr>
+              <w:t xml:space="preserve"> </w:t>
+            </w:r>
+            <w:proofErr w:type="spellStart"/>
+            <w:r>
+              <w:rPr>
+                <w:rFonts w:ascii="Times New Roman" w:hAnsi="Times New Roman" w:cs="Times New Roman"/>
+                <w:sz w:val="26"/>
+                <w:szCs w:val="26"/>
+              </w:rPr>
+              <w:t>yếu</w:t>
+            </w:r>
+            <w:proofErr w:type="spellEnd"/>
+            <w:r>
+              <w:rPr>
+                <w:rFonts w:ascii="Times New Roman" w:hAnsi="Times New Roman" w:cs="Times New Roman"/>
+                <w:sz w:val="26"/>
+                <w:szCs w:val="26"/>
+              </w:rPr>
+              <w:t xml:space="preserve"> ở Robustness</w:t>
+            </w:r>
+          </w:p>
+        </w:tc>
+      </w:tr>
+      <w:tr>
+        <w:tc>
+          <w:tcPr>
+            <w:tcW w:w="1790" w:type="dxa"/>
+            <w:vAlign w:val="center"/>
+          </w:tcPr>
+          <w:p>
+            <w:pPr>
+              <w:rPr>
+                <w:rFonts w:ascii="Times New Roman" w:hAnsi="Times New Roman" w:cs="Times New Roman"/>
+                <w:sz w:val="26"/>
+                <w:szCs w:val="26"/>
+              </w:rPr>
+            </w:pPr>
+            <w:r>
+              <w:rPr>
+                <w:rFonts w:ascii="Times New Roman" w:hAnsi="Times New Roman" w:cs="Times New Roman"/>
+                <w:sz w:val="26"/>
+                <w:szCs w:val="26"/>
+              </w:rPr>
+              <w:t>BVA Robustness</w:t>
+            </w:r>
+          </w:p>
+        </w:tc>
+        <w:tc>
+          <w:tcPr>
+            <w:tcW w:w="1803" w:type="dxa"/>
+            <w:vAlign w:val="center"/>
+          </w:tcPr>
+          <w:p>
+            <w:pPr>
+              <w:rPr>
+                <w:rFonts w:ascii="Times New Roman" w:hAnsi="Times New Roman" w:cs="Times New Roman"/>
+                <w:sz w:val="26"/>
+                <w:szCs w:val="26"/>
+              </w:rPr>
+            </w:pPr>
+            <w:r>
+              <w:rPr>
+                <w:rFonts w:ascii="Times New Roman" w:hAnsi="Times New Roman" w:cs="Times New Roman"/>
+                <w:sz w:val="26"/>
+                <w:szCs w:val="26"/>
+              </w:rPr>
+              <w:t>16 TC</w:t>
+            </w:r>
+          </w:p>
+        </w:tc>
+        <w:tc>
+          <w:tcPr>
+            <w:tcW w:w="2545" w:type="dxa"/>
+            <w:vAlign w:val="center"/>
+          </w:tcPr>
+          <w:p>
+            <w:pPr>
+              <w:rPr>
+                <w:rFonts w:ascii="Times New Roman" w:hAnsi="Times New Roman" w:cs="Times New Roman"/>
+                <w:sz w:val="26"/>
+                <w:szCs w:val="26"/>
+              </w:rPr>
+            </w:pPr>
+            <w:r>
+              <w:rPr>
+                <w:rFonts w:ascii="Times New Roman" w:hAnsi="Times New Roman" w:cs="Times New Roman"/>
+                <w:sz w:val="26"/>
+                <w:szCs w:val="26"/>
+              </w:rPr>
+              <w:t>FAIL → SCRUM-47, 48, 50, 51, 66–72</w:t>
+            </w:r>
+          </w:p>
+        </w:tc>
+        <w:tc>
+          <w:tcPr>
+            <w:tcW w:w="3212" w:type="dxa"/>
+            <w:vAlign w:val="center"/>
+          </w:tcPr>
+          <w:p>
+            <w:pPr>
+              <w:rPr>
+                <w:rFonts w:ascii="Times New Roman" w:hAnsi="Times New Roman" w:cs="Times New Roman"/>
+                <w:sz w:val="26"/>
+                <w:szCs w:val="26"/>
+              </w:rPr>
+            </w:pPr>
+            <w:r>
+              <w:rPr>
+                <w:rFonts w:ascii="Times New Roman" w:hAnsi="Times New Roman" w:cs="Times New Roman"/>
+                <w:sz w:val="26"/>
+                <w:szCs w:val="26"/>
+              </w:rPr>
+              <w:t>PASSED</w:t>
+            </w:r>
+          </w:p>
+        </w:tc>
+      </w:tr>
+      <w:tr>
+        <w:tc>
+          <w:tcPr>
+            <w:tcW w:w="1790" w:type="dxa"/>
+            <w:vAlign w:val="center"/>
+          </w:tcPr>
+          <w:p>
+            <w:pPr>
+              <w:rPr>
+                <w:rFonts w:ascii="Times New Roman" w:hAnsi="Times New Roman" w:cs="Times New Roman"/>
+                <w:sz w:val="26"/>
+                <w:szCs w:val="26"/>
+              </w:rPr>
+            </w:pPr>
+            <w:r>
+              <w:rPr>
+                <w:rFonts w:ascii="Times New Roman" w:hAnsi="Times New Roman" w:cs="Times New Roman"/>
+                <w:sz w:val="26"/>
+                <w:szCs w:val="26"/>
+              </w:rPr>
+              <w:t>Decision Table</w:t>
+            </w:r>
+          </w:p>
+        </w:tc>
+        <w:tc>
+          <w:tcPr>
+            <w:tcW w:w="1803" w:type="dxa"/>
+            <w:vAlign w:val="center"/>
+          </w:tcPr>
+          <w:p>
+            <w:pPr>
+              <w:rPr>
+                <w:rFonts w:ascii="Times New Roman" w:hAnsi="Times New Roman" w:cs="Times New Roman"/>
+                <w:sz w:val="26"/>
+                <w:szCs w:val="26"/>
+              </w:rPr>
+            </w:pPr>
+            <w:r>
+              <w:rPr>
+                <w:rFonts w:ascii="Times New Roman" w:hAnsi="Times New Roman" w:cs="Times New Roman"/>
+                <w:sz w:val="26"/>
+                <w:szCs w:val="26"/>
+              </w:rPr>
+              <w:t>32 TC</w:t>
+            </w:r>
+          </w:p>
+        </w:tc>
+        <w:tc>
+          <w:tcPr>
+            <w:tcW w:w="2545" w:type="dxa"/>
+            <w:vAlign w:val="center"/>
+          </w:tcPr>
+          <w:p>
+            <w:pPr>
+              <w:rPr>
+                <w:rFonts w:ascii="Times New Roman" w:hAnsi="Times New Roman" w:cs="Times New Roman"/>
+                <w:sz w:val="26"/>
+                <w:szCs w:val="26"/>
+              </w:rPr>
+            </w:pPr>
+            <w:r>
+              <w:rPr>
+                <w:rFonts w:ascii="Times New Roman" w:hAnsi="Times New Roman" w:cs="Times New Roman"/>
+                <w:sz w:val="26"/>
+                <w:szCs w:val="26"/>
+              </w:rPr>
+              <w:t xml:space="preserve">32 </w:t>
+            </w:r>
+            <w:proofErr w:type="gramStart"/>
+            <w:r>
+              <w:rPr>
+                <w:rFonts w:ascii="Times New Roman" w:hAnsi="Times New Roman" w:cs="Times New Roman"/>
+                <w:sz w:val="26"/>
+                <w:szCs w:val="26"/>
+              </w:rPr>
+              <w:t>PASS</w:t>
+            </w:r>
+            <w:proofErr w:type="gramEnd"/>
+          </w:p>
+        </w:tc>
+        <w:tc>
+          <w:tcPr>
+            <w:tcW w:w="3212" w:type="dxa"/>
+            <w:vAlign w:val="center"/>
+          </w:tcPr>
+          <w:p>
+            <w:pPr>
+              <w:rPr>
+                <w:rFonts w:ascii="Times New Roman" w:hAnsi="Times New Roman" w:cs="Times New Roman"/>
+                <w:sz w:val="26"/>
+                <w:szCs w:val="26"/>
+              </w:rPr>
+            </w:pPr>
+            <w:r>
+              <w:rPr>
+                <w:rFonts w:ascii="Times New Roman" w:hAnsi="Times New Roman" w:cs="Times New Roman"/>
+                <w:sz w:val="26"/>
+                <w:szCs w:val="26"/>
+              </w:rPr>
+              <w:t xml:space="preserve">32 </w:t>
+            </w:r>
+            <w:proofErr w:type="gramStart"/>
+            <w:r>
+              <w:rPr>
+                <w:rFonts w:ascii="Times New Roman" w:hAnsi="Times New Roman" w:cs="Times New Roman"/>
+                <w:sz w:val="26"/>
+                <w:szCs w:val="26"/>
+              </w:rPr>
+              <w:t>PASS</w:t>
+            </w:r>
+            <w:proofErr w:type="gramEnd"/>
+          </w:p>
+        </w:tc>
+      </w:tr>
+      <w:tr>
+        <w:tc>
+          <w:tcPr>
+            <w:tcW w:w="1790" w:type="dxa"/>
+            <w:vAlign w:val="center"/>
+          </w:tcPr>
+          <w:p>
+            <w:pPr>
+              <w:rPr>
+                <w:rFonts w:ascii="Times New Roman" w:hAnsi="Times New Roman" w:cs="Times New Roman"/>
+                <w:sz w:val="26"/>
+                <w:szCs w:val="26"/>
+              </w:rPr>
+            </w:pPr>
+            <w:r>
+              <w:rPr>
+                <w:rFonts w:ascii="Times New Roman" w:hAnsi="Times New Roman" w:cs="Times New Roman"/>
+                <w:sz w:val="26"/>
+                <w:szCs w:val="26"/>
+              </w:rPr>
+              <w:t>State Transition</w:t>
+            </w:r>
+          </w:p>
+        </w:tc>
+        <w:tc>
+          <w:tcPr>
+            <w:tcW w:w="1803" w:type="dxa"/>
+            <w:vAlign w:val="center"/>
+          </w:tcPr>
+          <w:p>
+            <w:pPr>
+              <w:rPr>
+                <w:rFonts w:ascii="Times New Roman" w:hAnsi="Times New Roman" w:cs="Times New Roman"/>
+                <w:sz w:val="26"/>
+                <w:szCs w:val="26"/>
+              </w:rPr>
+            </w:pPr>
+            <w:r>
+              <w:rPr>
+                <w:rFonts w:ascii="Times New Roman" w:hAnsi="Times New Roman" w:cs="Times New Roman"/>
+                <w:sz w:val="26"/>
+                <w:szCs w:val="26"/>
+              </w:rPr>
+              <w:t>15 TC</w:t>
+            </w:r>
+          </w:p>
+        </w:tc>
+        <w:tc>
+          <w:tcPr>
+            <w:tcW w:w="2545" w:type="dxa"/>
+            <w:vAlign w:val="center"/>
+          </w:tcPr>
+          <w:p>
+            <w:pPr>
+              <w:rPr>
+                <w:rFonts w:ascii="Times New Roman" w:hAnsi="Times New Roman" w:cs="Times New Roman"/>
+                <w:sz w:val="26"/>
+                <w:szCs w:val="26"/>
+              </w:rPr>
+            </w:pPr>
+            <w:r>
+              <w:rPr>
+                <w:rFonts w:ascii="Times New Roman" w:hAnsi="Times New Roman" w:cs="Times New Roman"/>
+                <w:sz w:val="26"/>
+                <w:szCs w:val="26"/>
+              </w:rPr>
+              <w:t>FAIL: TC-ST-03, 04, 05 → SCRUM-59</w:t>
+            </w:r>
+          </w:p>
+        </w:tc>
+        <w:tc>
+          <w:tcPr>
+            <w:tcW w:w="3212" w:type="dxa"/>
+            <w:vAlign w:val="center"/>
+          </w:tcPr>
+          <w:p>
+            <w:pPr>
+              <w:rPr>
+                <w:rFonts w:ascii="Times New Roman" w:hAnsi="Times New Roman" w:cs="Times New Roman"/>
+                <w:sz w:val="26"/>
+                <w:szCs w:val="26"/>
+              </w:rPr>
+            </w:pPr>
+            <w:r>
+              <w:rPr>
+                <w:rFonts w:ascii="Times New Roman" w:hAnsi="Times New Roman" w:cs="Times New Roman"/>
+                <w:sz w:val="26"/>
+                <w:szCs w:val="26"/>
+              </w:rPr>
+              <w:t>PASSED</w:t>
+            </w:r>
+          </w:p>
+        </w:tc>
+      </w:tr>
+      <w:tr>
+        <w:tc>
+          <w:tcPr>
+            <w:tcW w:w="1790" w:type="dxa"/>
+            <w:vAlign w:val="center"/>
+          </w:tcPr>
+          <w:p>
+            <w:pPr>
+              <w:rPr>
+                <w:rFonts w:ascii="Times New Roman" w:hAnsi="Times New Roman" w:cs="Times New Roman"/>
+                <w:sz w:val="26"/>
+                <w:szCs w:val="26"/>
+              </w:rPr>
+            </w:pPr>
+            <w:r>
+              <w:rPr>
+                <w:rFonts w:ascii="Times New Roman" w:hAnsi="Times New Roman" w:cs="Times New Roman"/>
+                <w:sz w:val="26"/>
+                <w:szCs w:val="26"/>
+              </w:rPr>
+              <w:t>White-box Unit</w:t>
+            </w:r>
+          </w:p>
+        </w:tc>
+        <w:tc>
+          <w:tcPr>
+            <w:tcW w:w="1803" w:type="dxa"/>
+            <w:vAlign w:val="center"/>
+          </w:tcPr>
+          <w:p>
+            <w:pPr>
+              <w:rPr>
+                <w:rFonts w:ascii="Times New Roman" w:hAnsi="Times New Roman" w:cs="Times New Roman"/>
+                <w:sz w:val="26"/>
+                <w:szCs w:val="26"/>
+              </w:rPr>
+            </w:pPr>
+            <w:r>
+              <w:rPr>
+                <w:rFonts w:ascii="Times New Roman" w:hAnsi="Times New Roman" w:cs="Times New Roman"/>
+                <w:sz w:val="26"/>
+                <w:szCs w:val="26"/>
+              </w:rPr>
+              <w:t>1</w:t>
+            </w:r>
+            <w:r>
+              <w:rPr>
+                <w:rFonts w:ascii="Times New Roman" w:hAnsi="Times New Roman" w:cs="Times New Roman"/>
+                <w:sz w:val="26"/>
+                <w:szCs w:val="26"/>
+              </w:rPr>
+              <w:t>35</w:t>
+            </w:r>
+            <w:r>
+              <w:rPr>
+                <w:rFonts w:ascii="Times New Roman" w:hAnsi="Times New Roman" w:cs="Times New Roman"/>
+                <w:sz w:val="26"/>
+                <w:szCs w:val="26"/>
+              </w:rPr>
+              <w:t xml:space="preserve"> tests</w:t>
+            </w:r>
+          </w:p>
+        </w:tc>
+        <w:tc>
+          <w:tcPr>
+            <w:tcW w:w="2545" w:type="dxa"/>
+            <w:vAlign w:val="center"/>
+          </w:tcPr>
+          <w:p>
+            <w:pPr>
+              <w:rPr>
+                <w:rFonts w:ascii="Times New Roman" w:hAnsi="Times New Roman" w:cs="Times New Roman"/>
+                <w:sz w:val="26"/>
+                <w:szCs w:val="26"/>
+              </w:rPr>
+            </w:pPr>
+            <w:r>
+              <w:rPr>
+                <w:rFonts w:ascii="Times New Roman" w:hAnsi="Times New Roman" w:cs="Times New Roman"/>
+                <w:sz w:val="26"/>
+                <w:szCs w:val="26"/>
+              </w:rPr>
+              <w:t>0 failure; Coverage ~97% Statement / 100% Branch (</w:t>
+            </w:r>
+            <w:proofErr w:type="spellStart"/>
+            <w:proofErr w:type="gramStart"/>
+            <w:r>
+              <w:rPr>
+                <w:rFonts w:ascii="Times New Roman" w:hAnsi="Times New Roman" w:cs="Times New Roman"/>
+                <w:sz w:val="26"/>
+                <w:szCs w:val="26"/>
+              </w:rPr>
+              <w:t>service.impl</w:t>
+            </w:r>
+            <w:proofErr w:type="spellEnd"/>
+            <w:proofErr w:type="gramEnd"/>
+            <w:r>
+              <w:rPr>
+                <w:rFonts w:ascii="Times New Roman" w:hAnsi="Times New Roman" w:cs="Times New Roman"/>
+                <w:sz w:val="26"/>
+                <w:szCs w:val="26"/>
+              </w:rPr>
+              <w:t>)</w:t>
+            </w:r>
+          </w:p>
+        </w:tc>
+        <w:tc>
+          <w:tcPr>
+            <w:tcW w:w="3212" w:type="dxa"/>
+            <w:vAlign w:val="center"/>
+          </w:tcPr>
+          <w:p>
+            <w:pPr>
+              <w:rPr>
+                <w:rFonts w:ascii="Times New Roman" w:hAnsi="Times New Roman" w:cs="Times New Roman"/>
+                <w:sz w:val="26"/>
+                <w:szCs w:val="26"/>
+              </w:rPr>
+            </w:pPr>
+            <w:r>
+              <w:rPr>
+                <w:rFonts w:ascii="Times New Roman" w:hAnsi="Times New Roman" w:cs="Times New Roman"/>
+                <w:sz w:val="26"/>
+                <w:szCs w:val="26"/>
+              </w:rPr>
+              <w:t>0 failure; Coverage ~97% Statement / 100% Branch (</w:t>
+            </w:r>
+            <w:proofErr w:type="spellStart"/>
+            <w:proofErr w:type="gramStart"/>
+            <w:r>
+              <w:rPr>
+                <w:rFonts w:ascii="Times New Roman" w:hAnsi="Times New Roman" w:cs="Times New Roman"/>
+                <w:sz w:val="26"/>
+                <w:szCs w:val="26"/>
+              </w:rPr>
+              <w:t>service.impl</w:t>
+            </w:r>
+            <w:proofErr w:type="spellEnd"/>
+            <w:proofErr w:type="gramEnd"/>
+            <w:r>
+              <w:rPr>
+                <w:rFonts w:ascii="Times New Roman" w:hAnsi="Times New Roman" w:cs="Times New Roman"/>
+                <w:sz w:val="26"/>
+                <w:szCs w:val="26"/>
+              </w:rPr>
+              <w:t>)</w:t>
+            </w:r>
+          </w:p>
+        </w:tc>
+      </w:tr>
+    </w:tbl>
     <w:p>
       <w:pPr>
         <w:rPr>
@@ -1686,7 +5611,7 @@
 </file>
 
 <file path=word/numbering.xml><?xml version="1.0" encoding="utf-8"?>
-<w:numbering xmlns:wpc="http://schemas.microsoft.com/office/word/2010/wordprocessingCanvas" xmlns:cx="http://schemas.microsoft.com/office/drawing/2014/chartex" xmlns:cx1="http://schemas.microsoft.com/office/drawing/2015/9/8/chartex" xmlns:cx2="http://schemas.microsoft.com/office/drawing/2015/10/21/chartex" xmlns:cx3="http://schemas.microsoft.com/office/drawing/2016/5/9/chartex" xmlns:cx4="http://schemas.microsoft.com/office/drawing/2016/5/10/chartex" xmlns:cx5="http://schemas.microsoft.com/office/drawing/2016/5/11/chartex" xmlns:cx6="http://schemas.microsoft.com/office/drawing/2016/5/12/chartex" xmlns:cx7="http://schemas.microsoft.com/office/drawing/2016/5/13/chartex" xmlns:cx8="http://schemas.microsoft.com/office/drawing/2016/5/14/chartex" xmlns:mc="http://schemas.openxmlformats.org/markup-compatibility/2006" xmlns:aink="http://schemas.microsoft.com/office/drawing/2016/ink" xmlns:am3d="http://schemas.microsoft.com/office/drawing/2017/model3d" xmlns:o="urn:schemas-microsoft-com:office:office" xmlns:r="http://schemas.openxmlformats.org/officeDocument/2006/relationships" xmlns:m="http://schemas.openxmlformats.org/officeDocument/2006/math" xmlns:v="urn:schemas-microsoft-com:vml" xmlns:wp14="http://schemas.microsoft.com/office/word/2010/wordprocessingDrawing" xmlns:wp="http://schemas.openxmlformats.org/drawingml/2006/wordprocessingDrawing" xmlns:w10="urn:schemas-microsoft-com:office:word" xmlns:w="http://schemas.openxmlformats.org/wordprocessingml/2006/main" xmlns:w14="http://schemas.microsoft.com/office/word/2010/wordml" xmlns:w15="http://schemas.microsoft.com/office/word/2012/wordml" xmlns:w16cid="http://schemas.microsoft.com/office/word/2016/wordml/cid" xmlns:w16se="http://schemas.microsoft.com/office/word/2015/wordml/symex" xmlns:wpg="http://schemas.microsoft.com/office/word/2010/wordprocessingGroup" xmlns:wpi="http://schemas.microsoft.com/office/word/2010/wordprocessingInk" xmlns:wne="http://schemas.microsoft.com/office/word/2006/wordml" xmlns:wps="http://schemas.microsoft.com/office/word/2010/wordprocessingShape" mc:Ignorable="w14 w15 w16se w16cid wp14">
+<w:numbering xmlns:wpc="http://schemas.microsoft.com/office/word/2010/wordprocessingCanvas" xmlns:cx="http://schemas.microsoft.com/office/drawing/2014/chartex" xmlns:cx1="http://schemas.microsoft.com/office/drawing/2015/9/8/chartex" xmlns:cx2="http://schemas.microsoft.com/office/drawing/2015/10/21/chartex" xmlns:cx3="http://schemas.microsoft.com/office/drawing/2016/5/9/chartex" xmlns:cx4="http://schemas.microsoft.com/office/drawing/2016/5/10/chartex" xmlns:cx5="http://schemas.microsoft.com/office/drawing/2016/5/11/chartex" xmlns:cx6="http://schemas.microsoft.com/office/drawing/2016/5/12/chartex" xmlns:cx7="http://schemas.microsoft.com/office/drawing/2016/5/13/chartex" xmlns:cx8="http://schemas.microsoft.com/office/drawing/2016/5/14/chartex" xmlns:mc="http://schemas.openxmlformats.org/markup-compatibility/2006" xmlns:m="http://schemas.openxmlformats.org/officeDocument/2006/math" xmlns:aink="http://schemas.microsoft.com/office/drawing/2016/ink" xmlns:am3d="http://schemas.microsoft.com/office/drawing/2017/model3d" xmlns:oel="http://schemas.microsoft.com/office/2019/extlst" xmlns:r="http://schemas.openxmlformats.org/officeDocument/2006/relationships" xmlns:wp14="http://schemas.microsoft.com/office/word/2010/wordprocessingDrawing" xmlns:wp="http://schemas.openxmlformats.org/drawingml/2006/wordprocessingDrawing" xmlns:wpg="http://schemas.microsoft.com/office/word/2010/wordprocessingGroup" xmlns:wpi="http://schemas.microsoft.com/office/word/2010/wordprocessingInk" xmlns:wps="http://schemas.microsoft.com/office/word/2010/wordprocessingShape" xmlns:o="urn:schemas-microsoft-com:office:office" xmlns:v="urn:schemas-microsoft-com:vml" xmlns:w10="urn:schemas-microsoft-com:office:word" xmlns:w="http://schemas.openxmlformats.org/wordprocessingml/2006/main" xmlns:w14="http://schemas.microsoft.com/office/word/2010/wordml" xmlns:w15="http://schemas.microsoft.com/office/word/2012/wordml" xmlns:w16cex="http://schemas.microsoft.com/office/word/2018/wordml/cex" xmlns:w16cid="http://schemas.microsoft.com/office/word/2016/wordml/cid" xmlns:w16="http://schemas.microsoft.com/office/word/2018/wordml" xmlns:w16sdtdh="http://schemas.microsoft.com/office/word/2020/wordml/sdtdatahash" xmlns:w16sdtfl="http://schemas.microsoft.com/office/word/2024/wordml/sdtformatlock" xmlns:w16se="http://schemas.microsoft.com/office/word/2015/wordml/symex" xmlns:w16du="http://schemas.microsoft.com/office/word/2023/wordml/word16du" xmlns:wne="http://schemas.microsoft.com/office/word/2006/wordml" mc:Ignorable="w14 w15 w16se w16cid w16 w16cex w16sdtdh w16sdtfl w16du wp14">
   <w:abstractNum w:abstractNumId="0" w15:restartNumberingAfterBreak="0">
     <w:nsid w:val="03174976"/>
     <w:multiLevelType w:val="multilevel"/>
@@ -2283,23 +6208,23 @@
       </w:rPr>
     </w:lvl>
   </w:abstractNum>
-  <w:num w:numId="1">
+  <w:num w:numId="1" w16cid:durableId="1351756360">
     <w:abstractNumId w:val="3"/>
   </w:num>
-  <w:num w:numId="2">
+  <w:num w:numId="2" w16cid:durableId="1539006678">
     <w:abstractNumId w:val="0"/>
   </w:num>
-  <w:num w:numId="3">
+  <w:num w:numId="3" w16cid:durableId="47608956">
     <w:abstractNumId w:val="2"/>
   </w:num>
-  <w:num w:numId="4">
+  <w:num w:numId="4" w16cid:durableId="776174754">
     <w:abstractNumId w:val="1"/>
   </w:num>
 </w:numbering>
 </file>
 
 <file path=word/styles.xml><?xml version="1.0" encoding="utf-8"?>
-<w:styles xmlns:mc="http://schemas.openxmlformats.org/markup-compatibility/2006" xmlns:r="http://schemas.openxmlformats.org/officeDocument/2006/relationships" xmlns:w="http://schemas.openxmlformats.org/wordprocessingml/2006/main" xmlns:w14="http://schemas.microsoft.com/office/word/2010/wordml" xmlns:w15="http://schemas.microsoft.com/office/word/2012/wordml" xmlns:w16cid="http://schemas.microsoft.com/office/word/2016/wordml/cid" xmlns:w16se="http://schemas.microsoft.com/office/word/2015/wordml/symex" mc:Ignorable="w14 w15 w16se w16cid">
+<w:styles xmlns:mc="http://schemas.openxmlformats.org/markup-compatibility/2006" xmlns:r="http://schemas.openxmlformats.org/officeDocument/2006/relationships" xmlns:w="http://schemas.openxmlformats.org/wordprocessingml/2006/main" xmlns:w14="http://schemas.microsoft.com/office/word/2010/wordml" xmlns:w15="http://schemas.microsoft.com/office/word/2012/wordml" xmlns:w16cex="http://schemas.microsoft.com/office/word/2018/wordml/cex" xmlns:w16cid="http://schemas.microsoft.com/office/word/2016/wordml/cid" xmlns:w16="http://schemas.microsoft.com/office/word/2018/wordml" xmlns:w16sdtdh="http://schemas.microsoft.com/office/word/2020/wordml/sdtdatahash" xmlns:w16sdtfl="http://schemas.microsoft.com/office/word/2024/wordml/sdtformatlock" xmlns:w16se="http://schemas.microsoft.com/office/word/2015/wordml/symex" xmlns:w16du="http://schemas.microsoft.com/office/word/2023/wordml/word16du" mc:Ignorable="w14 w15 w16se w16cid w16 w16cex w16sdtdh w16sdtfl w16du">
   <w:docDefaults>
     <w:rPrDefault>
       <w:rPr>
@@ -2315,7 +6240,7 @@
       </w:pPr>
     </w:pPrDefault>
   </w:docDefaults>
-  <w:latentStyles w:defLockedState="0" w:defUIPriority="99" w:defSemiHidden="0" w:defUnhideWhenUsed="0" w:defQFormat="0" w:count="375">
+  <w:latentStyles w:defLockedState="0" w:defUIPriority="99" w:defSemiHidden="0" w:defUnhideWhenUsed="0" w:defQFormat="0" w:count="376">
     <w:lsdException w:name="Normal" w:uiPriority="0" w:qFormat="1"/>
     <w:lsdException w:name="heading 1" w:uiPriority="9" w:qFormat="1"/>
     <w:lsdException w:name="heading 2" w:semiHidden="1" w:uiPriority="9" w:unhideWhenUsed="1" w:qFormat="1"/>
@@ -2691,6 +6616,7 @@
     <w:lsdException w:name="Smart Hyperlink" w:semiHidden="1" w:unhideWhenUsed="1"/>
     <w:lsdException w:name="Hashtag" w:semiHidden="1" w:unhideWhenUsed="1"/>
     <w:lsdException w:name="Unresolved Mention" w:semiHidden="1" w:unhideWhenUsed="1"/>
+    <w:lsdException w:name="Smart Link" w:semiHidden="1" w:unhideWhenUsed="1"/>
   </w:latentStyles>
   <w:style w:type="paragraph" w:default="1" w:styleId="Normal">
     <w:name w:val="Normal"/>

</xml_diff>